<commit_message>
fixed styles in input docx for ISO_26683-2.docx
</commit_message>
<xml_diff>
--- a/input/ISO_26683-2.docx
+++ b/input/ISO_26683-2.docx
@@ -1,10 +1,10 @@
 
 <file path=word/document.xml><?xml version="1.0" encoding="utf-8"?>
-<w:document xmlns:wpc="http://schemas.microsoft.com/office/word/2010/wordprocessingCanvas" xmlns:cx="http://schemas.microsoft.com/office/drawing/2014/chartex" xmlns:cx1="http://schemas.microsoft.com/office/drawing/2015/9/8/chartex" xmlns:mc="http://schemas.openxmlformats.org/markup-compatibility/2006" xmlns:o="urn:schemas-microsoft-com:office:office" xmlns:r="http://schemas.openxmlformats.org/officeDocument/2006/relationships" xmlns:m="http://schemas.openxmlformats.org/officeDocument/2006/math" xmlns:v="urn:schemas-microsoft-com:vml" xmlns:wp14="http://schemas.microsoft.com/office/word/2010/wordprocessingDrawing" xmlns:wp="http://schemas.openxmlformats.org/drawingml/2006/wordprocessingDrawing" xmlns:w10="urn:schemas-microsoft-com:office:word" xmlns:w="http://schemas.openxmlformats.org/wordprocessingml/2006/main" xmlns:w14="http://schemas.microsoft.com/office/word/2010/wordml" xmlns:w15="http://schemas.microsoft.com/office/word/2012/wordml" xmlns:w16se="http://schemas.microsoft.com/office/word/2015/wordml/symex" xmlns:wpg="http://schemas.microsoft.com/office/word/2010/wordprocessingGroup" xmlns:wpi="http://schemas.microsoft.com/office/word/2010/wordprocessingInk" xmlns:wne="http://schemas.microsoft.com/office/word/2006/wordml" xmlns:wps="http://schemas.microsoft.com/office/word/2010/wordprocessingShape" mc:Ignorable="w14 w15 w16se wp14">
+<w:document xmlns:wpc="http://schemas.microsoft.com/office/word/2010/wordprocessingCanvas" xmlns:cx="http://schemas.microsoft.com/office/drawing/2014/chartex" xmlns:cx1="http://schemas.microsoft.com/office/drawing/2015/9/8/chartex" xmlns:cx2="http://schemas.microsoft.com/office/drawing/2015/10/21/chartex" xmlns:cx3="http://schemas.microsoft.com/office/drawing/2016/5/9/chartex" xmlns:cx4="http://schemas.microsoft.com/office/drawing/2016/5/10/chartex" xmlns:cx5="http://schemas.microsoft.com/office/drawing/2016/5/11/chartex" xmlns:cx6="http://schemas.microsoft.com/office/drawing/2016/5/12/chartex" xmlns:cx7="http://schemas.microsoft.com/office/drawing/2016/5/13/chartex" xmlns:cx8="http://schemas.microsoft.com/office/drawing/2016/5/14/chartex" xmlns:mc="http://schemas.openxmlformats.org/markup-compatibility/2006" xmlns:aink="http://schemas.microsoft.com/office/drawing/2016/ink" xmlns:am3d="http://schemas.microsoft.com/office/drawing/2017/model3d" xmlns:o="urn:schemas-microsoft-com:office:office" xmlns:oel="http://schemas.microsoft.com/office/2019/extlst" xmlns:r="http://schemas.openxmlformats.org/officeDocument/2006/relationships" xmlns:m="http://schemas.openxmlformats.org/officeDocument/2006/math" xmlns:v="urn:schemas-microsoft-com:vml" xmlns:wp14="http://schemas.microsoft.com/office/word/2010/wordprocessingDrawing" xmlns:wp="http://schemas.openxmlformats.org/drawingml/2006/wordprocessingDrawing" xmlns:w10="urn:schemas-microsoft-com:office:word" xmlns:w="http://schemas.openxmlformats.org/wordprocessingml/2006/main" xmlns:w14="http://schemas.microsoft.com/office/word/2010/wordml" xmlns:w15="http://schemas.microsoft.com/office/word/2012/wordml" xmlns:w16cex="http://schemas.microsoft.com/office/word/2018/wordml/cex" xmlns:w16cid="http://schemas.microsoft.com/office/word/2016/wordml/cid" xmlns:w16="http://schemas.microsoft.com/office/word/2018/wordml" xmlns:w16du="http://schemas.microsoft.com/office/word/2023/wordml/word16du" xmlns:w16sdtdh="http://schemas.microsoft.com/office/word/2020/wordml/sdtdatahash" xmlns:w16sdtfl="http://schemas.microsoft.com/office/word/2024/wordml/sdtformatlock" xmlns:w16se="http://schemas.microsoft.com/office/word/2015/wordml/symex" xmlns:wpg="http://schemas.microsoft.com/office/word/2010/wordprocessingGroup" xmlns:wpi="http://schemas.microsoft.com/office/word/2010/wordprocessingInk" xmlns:wne="http://schemas.microsoft.com/office/word/2006/wordml" xmlns:wps="http://schemas.microsoft.com/office/word/2010/wordprocessingShape" mc:Ignorable="w14 w15 w16se w16cid w16 w16cex w16sdtdh w16sdtfl w16du wp14">
   <w:body>
     <w:p>
       <w:pPr>
-        <w:pStyle w:val="Nzev"/>
+        <w:pStyle w:val="Title"/>
         <w:spacing w:after="60"/>
         <w:rPr>
           <w:b w:val="0"/>
@@ -154,7 +154,7 @@
     </w:tbl>
     <w:p>
       <w:pPr>
-        <w:pStyle w:val="Titulek"/>
+        <w:pStyle w:val="Caption"/>
       </w:pPr>
       <w:r>
         <w:tab/>
@@ -172,12 +172,12 @@
     </w:p>
     <w:p>
       <w:pPr>
-        <w:pStyle w:val="Nadpis1"/>
+        <w:pStyle w:val="Heading1"/>
       </w:pPr>
     </w:p>
     <w:p>
       <w:pPr>
-        <w:pStyle w:val="Nadpis1"/>
+        <w:pStyle w:val="Heading1"/>
       </w:pPr>
       <w:r>
         <w:t>Introduction</w:t>
@@ -243,16 +243,13 @@
     </w:p>
     <w:p>
       <w:pPr>
-        <w:pStyle w:val="Poznmka"/>
-        <w:spacing w:before="57" w:after="57"/>
-        <w:rPr>
-          <w:i w:val="0"/>
-          <w:color w:val="000000"/>
-        </w:rPr>
-      </w:pPr>
-      <w:r>
-        <w:rPr>
-          <w:i w:val="0"/>
+        <w:rPr>
+          <w:i/>
+          <w:color w:val="000000"/>
+        </w:rPr>
+      </w:pPr>
+      <w:r>
+        <w:rPr>
           <w:color w:val="000000"/>
         </w:rPr>
         <w:t>The aim is to enable the effective handling of vehicle and trailer/semi</w:t>
@@ -260,38 +257,25 @@
       <w:r>
         <w:rPr>
           <w:rFonts w:ascii="Cambria Math" w:hAnsi="Cambria Math" w:cs="Cambria Math"/>
-          <w:i w:val="0"/>
           <w:color w:val="000000"/>
         </w:rPr>
         <w:t>‑</w:t>
       </w:r>
       <w:r>
         <w:rPr>
-          <w:i w:val="0"/>
-          <w:color w:val="000000"/>
-        </w:rPr>
-        <w:t xml:space="preserve">trailer identification in connection with </w:t>
-      </w:r>
-      <w:proofErr w:type="spellStart"/>
-      <w:r>
-        <w:rPr>
-          <w:i w:val="0"/>
-          <w:color w:val="000000"/>
-        </w:rPr>
-        <w:t>en</w:t>
-      </w:r>
-      <w:proofErr w:type="spellEnd"/>
+          <w:color w:val="000000"/>
+        </w:rPr>
+        <w:t>trailer identification in connection with en</w:t>
+      </w:r>
       <w:r>
         <w:rPr>
           <w:rFonts w:ascii="Cambria Math" w:hAnsi="Cambria Math" w:cs="Cambria Math"/>
-          <w:i w:val="0"/>
           <w:color w:val="000000"/>
         </w:rPr>
         <w:t>‑</w:t>
       </w:r>
       <w:r>
         <w:rPr>
-          <w:i w:val="0"/>
           <w:color w:val="000000"/>
         </w:rPr>
         <w:t>route cargo information within the vehicle</w:t>
@@ -299,14 +283,12 @@
       <w:r>
         <w:rPr>
           <w:rFonts w:cs="Arial"/>
-          <w:i w:val="0"/>
           <w:color w:val="000000"/>
         </w:rPr>
         <w:t>’</w:t>
       </w:r>
       <w:r>
         <w:rPr>
-          <w:i w:val="0"/>
           <w:color w:val="000000"/>
         </w:rPr>
         <w:t>s on</w:t>
@@ -314,14 +296,12 @@
       <w:r>
         <w:rPr>
           <w:rFonts w:ascii="Cambria Math" w:hAnsi="Cambria Math" w:cs="Cambria Math"/>
-          <w:i w:val="0"/>
           <w:color w:val="000000"/>
         </w:rPr>
         <w:t>‑</w:t>
       </w:r>
       <w:r>
         <w:rPr>
-          <w:i w:val="0"/>
           <w:color w:val="000000"/>
         </w:rPr>
         <w:t>board system. This supports real</w:t>
@@ -329,14 +309,12 @@
       <w:r>
         <w:rPr>
           <w:rFonts w:ascii="Cambria Math" w:hAnsi="Cambria Math" w:cs="Cambria Math"/>
-          <w:i w:val="0"/>
           <w:color w:val="000000"/>
         </w:rPr>
         <w:t>‑</w:t>
       </w:r>
       <w:r>
         <w:rPr>
-          <w:i w:val="0"/>
           <w:color w:val="000000"/>
         </w:rPr>
         <w:t>time vehicle tracking and tracing, as well as cargo monitoring. It enables shipment auditing and provides visibility into cargo status.</w:t>
@@ -344,10 +322,8 @@
     </w:p>
     <w:p>
       <w:pPr>
-        <w:pStyle w:val="Poznmka"/>
-        <w:spacing w:before="57" w:after="57"/>
-        <w:rPr>
-          <w:i w:val="0"/>
+        <w:rPr>
+          <w:i/>
           <w:color w:val="000000"/>
         </w:rPr>
       </w:pPr>
@@ -355,284 +331,10 @@
         <w:r>
           <w:rPr>
             <w:rStyle w:val="Internetovodkaz"/>
-            <w:i w:val="0"/>
           </w:rPr>
           <w:t>ISO 26683-1</w:t>
         </w:r>
       </w:hyperlink>
-      <w:r>
-        <w:rPr>
-          <w:rStyle w:val="Internetovodkaz"/>
-          <w:rFonts w:eastAsia="Calibri"/>
-          <w:i w:val="0"/>
-          <w:color w:val="auto"/>
-          <w:kern w:val="2"/>
-          <w:u w:val="none"/>
-          <w:lang w:val="cs-CZ" w:eastAsia="zh-CN"/>
-        </w:rPr>
-        <w:t xml:space="preserve"> </w:t>
-      </w:r>
-      <w:r>
-        <w:rPr>
-          <w:i w:val="0"/>
-          <w:color w:val="000000"/>
-        </w:rPr>
-        <w:t>provides the context and architecture for the collection and transmission of aggregated data on cargo and transport units to carriers’ commercial operating systems or to public</w:t>
-      </w:r>
-      <w:r>
-        <w:rPr>
-          <w:rFonts w:ascii="Cambria Math" w:hAnsi="Cambria Math" w:cs="Cambria Math"/>
-          <w:i w:val="0"/>
-          <w:color w:val="000000"/>
-        </w:rPr>
-        <w:t>‑</w:t>
-      </w:r>
-      <w:r>
-        <w:rPr>
-          <w:i w:val="0"/>
-          <w:color w:val="000000"/>
-        </w:rPr>
-        <w:t>sector systems (e.g.</w:t>
-      </w:r>
-      <w:r>
-        <w:rPr>
-          <w:i w:val="0"/>
-          <w:color w:val="000000"/>
-        </w:rPr>
-        <w:t xml:space="preserve"> </w:t>
-      </w:r>
-      <w:r>
-        <w:rPr>
-          <w:i w:val="0"/>
-          <w:color w:val="000000"/>
-        </w:rPr>
-        <w:t>customs, transport statistics, international trade). It also lists the reference standards relevant to all parts of this standard family.</w:t>
-      </w:r>
-    </w:p>
-    <w:p>
-      <w:pPr>
-        <w:pStyle w:val="Poznmka"/>
-        <w:spacing w:before="57" w:after="57"/>
-        <w:rPr>
-          <w:color w:val="000000"/>
-          <w:sz w:val="18"/>
-          <w:szCs w:val="18"/>
-        </w:rPr>
-      </w:pPr>
-      <w:hyperlink r:id="rId9">
-        <w:r>
-          <w:rPr>
-            <w:rStyle w:val="Internetovodkaz"/>
-            <w:i w:val="0"/>
-          </w:rPr>
-          <w:t>ISO 26683-2</w:t>
-        </w:r>
-      </w:hyperlink>
-      <w:r>
-        <w:rPr>
-          <w:i w:val="0"/>
-          <w:color w:val="000000"/>
-        </w:rPr>
-        <w:t xml:space="preserve"> </w:t>
-      </w:r>
-      <w:r>
-        <w:rPr>
-          <w:i w:val="0"/>
-          <w:color w:val="000000"/>
-        </w:rPr>
-        <w:t>(</w:t>
-      </w:r>
-      <w:r>
-        <w:rPr>
-          <w:color w:val="000000"/>
-        </w:rPr>
-        <w:t>further on</w:t>
-      </w:r>
-      <w:r>
-        <w:rPr>
-          <w:color w:val="000000"/>
-        </w:rPr>
-        <w:t xml:space="preserve"> </w:t>
-      </w:r>
-      <w:r>
-        <w:rPr>
-          <w:color w:val="000000"/>
-        </w:rPr>
-        <w:t xml:space="preserve">also </w:t>
-      </w:r>
-      <w:r>
-        <w:rPr>
-          <w:color w:val="000000"/>
-        </w:rPr>
-        <w:t>referred to as “the document described”)</w:t>
-      </w:r>
-      <w:r>
-        <w:rPr>
-          <w:i w:val="0"/>
-          <w:color w:val="000000"/>
-        </w:rPr>
-        <w:t xml:space="preserve"> contains descriptions of various application interface profiles for communication during the identification of cargo or the contents of freight vehicles, linked to other services such as handling in multimodal transport.</w:t>
-      </w:r>
-    </w:p>
-    <w:p>
-      <w:pPr>
-        <w:spacing w:before="240" w:after="120" w:line="276" w:lineRule="auto"/>
-        <w:rPr>
-          <w:rFonts w:eastAsia="Arial" w:cs="Arial"/>
-          <w:i/>
-          <w:color w:val="003366"/>
-        </w:rPr>
-      </w:pPr>
-      <w:r>
-        <w:rPr>
-          <w:rFonts w:eastAsia="Arial" w:cs="Arial"/>
-          <w:i/>
-          <w:color w:val="003366"/>
-        </w:rPr>
-        <w:t xml:space="preserve">Note: The Extract presents selected </w:t>
-      </w:r>
-      <w:r>
-        <w:rPr>
-          <w:rFonts w:eastAsia="Arial" w:cs="Arial"/>
-          <w:i/>
-          <w:color w:val="003366"/>
-        </w:rPr>
-        <w:t>chapters</w:t>
-      </w:r>
-      <w:r>
-        <w:rPr>
-          <w:rFonts w:eastAsia="Arial" w:cs="Arial"/>
-          <w:i/>
-          <w:color w:val="003366"/>
-        </w:rPr>
-        <w:t xml:space="preserve"> of the described document and retains the original </w:t>
-      </w:r>
-      <w:r>
-        <w:rPr>
-          <w:rFonts w:eastAsia="Arial" w:cs="Arial"/>
-          <w:i/>
-          <w:color w:val="003366"/>
-        </w:rPr>
-        <w:t>chapter</w:t>
-      </w:r>
-      <w:r>
-        <w:rPr>
-          <w:rFonts w:eastAsia="Arial" w:cs="Arial"/>
-          <w:i/>
-          <w:color w:val="003366"/>
-        </w:rPr>
-        <w:t xml:space="preserve"> numbering.</w:t>
-      </w:r>
-    </w:p>
-    <w:p>
-      <w:pPr>
-        <w:pStyle w:val="Nadpis1"/>
-        <w:rPr>
-          <w:highlight w:val="yellow"/>
-        </w:rPr>
-      </w:pPr>
-      <w:r>
-        <w:t>Usage</w:t>
-      </w:r>
-    </w:p>
-    <w:p>
-      <w:pPr>
-        <w:pStyle w:val="Poznmka"/>
-        <w:spacing w:before="57" w:after="57"/>
-        <w:rPr>
-          <w:i w:val="0"/>
-          <w:color w:val="000000"/>
-        </w:rPr>
-      </w:pPr>
-      <w:bookmarkStart w:id="1" w:name="_Toc473558465"/>
-      <w:r>
-        <w:rPr>
-          <w:i w:val="0"/>
-          <w:color w:val="000000"/>
-        </w:rPr>
-        <w:t>This set of standards provides examples for designing interoperable systems related to transport means and cargo. It covers the provision of information for tracking, managing, and tracing goods in multimodal transport and handling — from the individual item level, regardless of the number or type of packaging or transport units, to the description of the connection with the transport vehicle/unit and the infrastructure (e.g., a dispatch centre).</w:t>
-      </w:r>
-    </w:p>
-    <w:p>
-      <w:pPr>
-        <w:pStyle w:val="Poznmka"/>
-        <w:spacing w:before="57" w:after="57"/>
-        <w:rPr>
-          <w:i w:val="0"/>
-          <w:color w:val="000000"/>
-        </w:rPr>
-      </w:pPr>
-      <w:r>
-        <w:rPr>
-          <w:i w:val="0"/>
-        </w:rPr>
-        <w:t>The document described</w:t>
-      </w:r>
-      <w:r>
-        <w:rPr>
-          <w:i w:val="0"/>
-          <w:color w:val="000000"/>
-        </w:rPr>
-        <w:t xml:space="preserve"> </w:t>
-      </w:r>
-      <w:r>
-        <w:rPr>
-          <w:i w:val="0"/>
-          <w:color w:val="000000"/>
-        </w:rPr>
-        <w:t>specifies</w:t>
-      </w:r>
-      <w:r>
-        <w:rPr>
-          <w:i w:val="0"/>
-          <w:color w:val="000000"/>
-        </w:rPr>
-        <w:t xml:space="preserve"> interface profiles for various types of communication that enable interoperability in multimodal freight transport. The document allows readers to understand scenarios for possible freight</w:t>
-      </w:r>
-      <w:r>
-        <w:rPr>
-          <w:rFonts w:ascii="Cambria Math" w:hAnsi="Cambria Math" w:cs="Cambria Math"/>
-          <w:i w:val="0"/>
-          <w:color w:val="000000"/>
-        </w:rPr>
-        <w:t>‑</w:t>
-      </w:r>
-      <w:r>
-        <w:rPr>
-          <w:i w:val="0"/>
-          <w:color w:val="000000"/>
-        </w:rPr>
-        <w:t>unit configurations and the related communication using the defined profiles. In addition to the technical description, each profile includes a set of standards that must be considered for interoperability, presented in a clear and detailed way for potential users.</w:t>
-      </w:r>
-    </w:p>
-    <w:bookmarkEnd w:id="1"/>
-    <w:p>
-      <w:pPr>
-        <w:pStyle w:val="Nadpis1"/>
-        <w:rPr>
-          <w:highlight w:val="yellow"/>
-        </w:rPr>
-      </w:pPr>
-      <w:r>
-        <w:t>Scope</w:t>
-      </w:r>
-    </w:p>
-    <w:p>
-      <w:pPr>
-        <w:pStyle w:val="Textnormy"/>
-        <w:spacing w:after="6"/>
-        <w:rPr>
-          <w:rFonts w:eastAsia="Calibri"/>
-          <w:kern w:val="2"/>
-          <w:lang w:val="cs-CZ" w:eastAsia="zh-CN"/>
-        </w:rPr>
-      </w:pPr>
-      <w:r>
-        <w:t xml:space="preserve">The document described focuses on application interface profiles for data aggregation and transfer in the context </w:t>
-      </w:r>
-      <w:r>
-        <w:t xml:space="preserve">of </w:t>
-      </w:r>
       <w:r>
         <w:rPr>
           <w:rStyle w:val="Internetovodkaz"/>
@@ -642,6 +344,234 @@
           <w:u w:val="none"/>
           <w:lang w:val="cs-CZ" w:eastAsia="zh-CN"/>
         </w:rPr>
+        <w:t xml:space="preserve"> </w:t>
+      </w:r>
+      <w:r>
+        <w:rPr>
+          <w:color w:val="000000"/>
+        </w:rPr>
+        <w:t>provides the context and architecture for the collection and transmission of aggregated data on cargo and transport units to carriers’ commercial operating systems or to public</w:t>
+      </w:r>
+      <w:r>
+        <w:rPr>
+          <w:rFonts w:ascii="Cambria Math" w:hAnsi="Cambria Math" w:cs="Cambria Math"/>
+          <w:color w:val="000000"/>
+        </w:rPr>
+        <w:t>‑</w:t>
+      </w:r>
+      <w:r>
+        <w:rPr>
+          <w:color w:val="000000"/>
+        </w:rPr>
+        <w:t>sector systems (e.g.</w:t>
+      </w:r>
+      <w:r>
+        <w:rPr>
+          <w:color w:val="000000"/>
+        </w:rPr>
+        <w:t xml:space="preserve"> </w:t>
+      </w:r>
+      <w:r>
+        <w:rPr>
+          <w:color w:val="000000"/>
+        </w:rPr>
+        <w:t>customs, transport statistics, international trade). It also lists the reference standards relevant to all parts of this standard family.</w:t>
+      </w:r>
+    </w:p>
+    <w:p>
+      <w:pPr>
+        <w:rPr>
+          <w:color w:val="000000"/>
+          <w:sz w:val="18"/>
+          <w:szCs w:val="18"/>
+        </w:rPr>
+      </w:pPr>
+      <w:hyperlink r:id="rId9">
+        <w:r>
+          <w:rPr>
+            <w:rStyle w:val="Internetovodkaz"/>
+          </w:rPr>
+          <w:t>ISO 26683-2</w:t>
+        </w:r>
+      </w:hyperlink>
+      <w:r>
+        <w:rPr>
+          <w:color w:val="000000"/>
+        </w:rPr>
+        <w:t xml:space="preserve"> </w:t>
+      </w:r>
+      <w:r>
+        <w:rPr>
+          <w:color w:val="000000"/>
+        </w:rPr>
+        <w:t>(</w:t>
+      </w:r>
+      <w:r>
+        <w:rPr>
+          <w:color w:val="000000"/>
+        </w:rPr>
+        <w:t>further on</w:t>
+      </w:r>
+      <w:r>
+        <w:rPr>
+          <w:color w:val="000000"/>
+        </w:rPr>
+        <w:t xml:space="preserve"> </w:t>
+      </w:r>
+      <w:r>
+        <w:rPr>
+          <w:color w:val="000000"/>
+        </w:rPr>
+        <w:t xml:space="preserve">also </w:t>
+      </w:r>
+      <w:r>
+        <w:rPr>
+          <w:color w:val="000000"/>
+        </w:rPr>
+        <w:t>referred to as “the document described”)</w:t>
+      </w:r>
+      <w:r>
+        <w:rPr>
+          <w:color w:val="000000"/>
+        </w:rPr>
+        <w:t xml:space="preserve"> contains descriptions of various application interface profiles for communication during the identification of cargo or the contents of freight vehicles, linked to other services such as handling in multimodal transport.</w:t>
+      </w:r>
+    </w:p>
+    <w:p>
+      <w:pPr>
+        <w:spacing w:before="240" w:after="120" w:line="276" w:lineRule="auto"/>
+        <w:rPr>
+          <w:rFonts w:eastAsia="Arial" w:cs="Arial"/>
+          <w:i/>
+          <w:color w:val="003366"/>
+        </w:rPr>
+      </w:pPr>
+      <w:r>
+        <w:rPr>
+          <w:rFonts w:eastAsia="Arial" w:cs="Arial"/>
+          <w:i/>
+          <w:color w:val="003366"/>
+        </w:rPr>
+        <w:t xml:space="preserve">Note: The Extract presents selected </w:t>
+      </w:r>
+      <w:r>
+        <w:rPr>
+          <w:rFonts w:eastAsia="Arial" w:cs="Arial"/>
+          <w:i/>
+          <w:color w:val="003366"/>
+        </w:rPr>
+        <w:t>chapters</w:t>
+      </w:r>
+      <w:r>
+        <w:rPr>
+          <w:rFonts w:eastAsia="Arial" w:cs="Arial"/>
+          <w:i/>
+          <w:color w:val="003366"/>
+        </w:rPr>
+        <w:t xml:space="preserve"> of the described document and retains the original </w:t>
+      </w:r>
+      <w:r>
+        <w:rPr>
+          <w:rFonts w:eastAsia="Arial" w:cs="Arial"/>
+          <w:i/>
+          <w:color w:val="003366"/>
+        </w:rPr>
+        <w:t>chapter</w:t>
+      </w:r>
+      <w:r>
+        <w:rPr>
+          <w:rFonts w:eastAsia="Arial" w:cs="Arial"/>
+          <w:i/>
+          <w:color w:val="003366"/>
+        </w:rPr>
+        <w:t xml:space="preserve"> numbering.</w:t>
+      </w:r>
+    </w:p>
+    <w:p>
+      <w:pPr>
+        <w:pStyle w:val="Heading1"/>
+        <w:rPr>
+          <w:highlight w:val="yellow"/>
+        </w:rPr>
+      </w:pPr>
+      <w:r>
+        <w:t>Usage</w:t>
+      </w:r>
+    </w:p>
+    <w:p>
+      <w:pPr>
+        <w:rPr>
+          <w:i/>
+        </w:rPr>
+      </w:pPr>
+      <w:bookmarkStart w:id="1" w:name="_Toc473558465"/>
+      <w:r>
+        <w:t>This set of standards provides examples for designing interoperable systems related to transport means and cargo. It covers the provision of information for tracking, managing, and tracing goods in multimodal transport and handling — from the individual item level, regardless of the number or type of packaging or transport units, to the description of the connection with the transport vehicle/unit and the infrastructure (e.g., a dispatch centre).</w:t>
+      </w:r>
+    </w:p>
+    <w:p>
+      <w:pPr>
+        <w:rPr>
+          <w:i/>
+        </w:rPr>
+      </w:pPr>
+      <w:r>
+        <w:t>The document described</w:t>
+      </w:r>
+      <w:r>
+        <w:t xml:space="preserve"> </w:t>
+      </w:r>
+      <w:r>
+        <w:t>specifies</w:t>
+      </w:r>
+      <w:r>
+        <w:t xml:space="preserve"> interface profiles for various types of communication that enable interoperability in multimodal freight transport. The document allows readers to understand scenarios for possible freight</w:t>
+      </w:r>
+      <w:r>
+        <w:rPr>
+          <w:rFonts w:ascii="Cambria Math" w:hAnsi="Cambria Math" w:cs="Cambria Math"/>
+        </w:rPr>
+        <w:t>‑</w:t>
+      </w:r>
+      <w:r>
+        <w:t>unit configurations and the related communication using the defined profiles. In addition to the technical description, each profile includes a set of standards that must be considered for interoperability, presented in a clear and detailed way for potential users.</w:t>
+      </w:r>
+    </w:p>
+    <w:bookmarkEnd w:id="1"/>
+    <w:p>
+      <w:pPr>
+        <w:pStyle w:val="Heading1"/>
+        <w:rPr>
+          <w:highlight w:val="yellow"/>
+        </w:rPr>
+      </w:pPr>
+      <w:r>
+        <w:t>Scope</w:t>
+      </w:r>
+    </w:p>
+    <w:p>
+      <w:pPr>
+        <w:rPr>
+          <w:rFonts w:eastAsia="Calibri"/>
+          <w:kern w:val="2"/>
+          <w:lang w:val="cs-CZ" w:eastAsia="zh-CN"/>
+        </w:rPr>
+      </w:pPr>
+      <w:r>
+        <w:t xml:space="preserve">The document described focuses on application interface profiles for data aggregation and transfer in the context </w:t>
+      </w:r>
+      <w:r>
+        <w:t xml:space="preserve">of </w:t>
+      </w:r>
+      <w:r>
+        <w:rPr>
+          <w:rStyle w:val="Internetovodkaz"/>
+          <w:rFonts w:eastAsia="Calibri"/>
+          <w:color w:val="auto"/>
+          <w:kern w:val="2"/>
+          <w:u w:val="none"/>
+          <w:lang w:val="cs-CZ" w:eastAsia="zh-CN"/>
+        </w:rPr>
         <w:t>ISO 26683-1</w:t>
       </w:r>
       <w:r>
@@ -690,10 +620,9 @@
     </w:p>
     <w:p>
       <w:pPr>
-        <w:pStyle w:val="Nadpis1"/>
-      </w:pPr>
-      <w:r>
-        <w:lastRenderedPageBreak/>
+        <w:pStyle w:val="Heading1"/>
+      </w:pPr>
+      <w:r>
         <w:t>Related Documents (Selection)</w:t>
       </w:r>
     </w:p>
@@ -745,26 +674,26 @@
         <w:t xml:space="preserve"> </w:t>
       </w:r>
       <w:r>
-        <w:t xml:space="preserve">used in particular profiles are listed in </w:t>
+        <w:t xml:space="preserve">used </w:t>
+      </w:r>
+      <w:proofErr w:type="gramStart"/>
+      <w:r>
+        <w:t>in particular profiles</w:t>
+      </w:r>
+      <w:proofErr w:type="gramEnd"/>
+      <w:r>
+        <w:t xml:space="preserve"> are listed in </w:t>
       </w:r>
       <w:r>
         <w:t>Clause</w:t>
       </w:r>
       <w:r>
-        <w:t xml:space="preserve"> 6, directly within the </w:t>
-      </w:r>
-      <w:proofErr w:type="gramStart"/>
-      <w:r>
-        <w:t>individual</w:t>
-      </w:r>
-      <w:proofErr w:type="gramEnd"/>
-      <w:r>
-        <w:t xml:space="preserve"> application interface profiles.</w:t>
+        <w:t xml:space="preserve"> 6, directly within the individual application interface profiles.</w:t>
       </w:r>
     </w:p>
     <w:p>
       <w:pPr>
-        <w:pStyle w:val="Nadpis1"/>
+        <w:pStyle w:val="Heading1"/>
         <w:rPr>
           <w:highlight w:val="darkYellow"/>
         </w:rPr>
@@ -799,6 +728,7 @@
       <w:bookmarkStart w:id="29" w:name="_Toc359251365"/>
       <w:bookmarkStart w:id="30" w:name="_Toc473558467"/>
       <w:r>
+        <w:lastRenderedPageBreak/>
         <w:t>3 </w:t>
       </w:r>
       <w:bookmarkEnd w:id="2"/>
@@ -835,13 +765,9 @@
       </w:r>
     </w:p>
     <w:p>
-      <w:pPr>
-        <w:pStyle w:val="Textnormy"/>
-      </w:pPr>
       <w:r>
         <w:rPr>
           <w:rFonts w:eastAsia="Calibri"/>
-          <w:color w:val="000000"/>
           <w:kern w:val="2"/>
           <w:lang w:eastAsia="ar-SA"/>
         </w:rPr>
@@ -850,7 +776,6 @@
       <w:r>
         <w:rPr>
           <w:rFonts w:eastAsia="Calibri"/>
-          <w:color w:val="000000"/>
           <w:kern w:val="2"/>
           <w:lang w:eastAsia="ar-SA"/>
         </w:rPr>
@@ -859,45 +784,28 @@
       <w:r>
         <w:rPr>
           <w:rFonts w:eastAsia="Calibri"/>
-          <w:color w:val="000000"/>
           <w:kern w:val="2"/>
           <w:lang w:eastAsia="ar-SA"/>
         </w:rPr>
         <w:t xml:space="preserve"> defines 33 terms; t</w:t>
       </w:r>
       <w:r>
-        <w:rPr>
-          <w:color w:val="000000"/>
-        </w:rPr>
         <w:t xml:space="preserve">he Extract lists only </w:t>
       </w:r>
       <w:r>
-        <w:rPr>
-          <w:color w:val="000000"/>
-        </w:rPr>
         <w:t xml:space="preserve">selection of </w:t>
       </w:r>
       <w:r>
-        <w:rPr>
-          <w:color w:val="000000"/>
-        </w:rPr>
         <w:t>the most important</w:t>
       </w:r>
       <w:r>
-        <w:rPr>
-          <w:color w:val="000000"/>
-        </w:rPr>
         <w:t xml:space="preserve"> ones:</w:t>
       </w:r>
       <w:r>
-        <w:rPr>
-          <w:color w:val="000000"/>
-        </w:rPr>
         <w:t xml:space="preserve"> </w:t>
       </w:r>
     </w:p>
     <w:p>
-      <w:proofErr w:type="gramStart"/>
       <w:r>
         <w:rPr>
           <w:rStyle w:val="Internetovodkaz"/>
@@ -909,9 +817,9 @@
           <w:u w:val="none"/>
           <w:lang w:eastAsia="zh-CN"/>
         </w:rPr>
-        <w:t>application</w:t>
-      </w:r>
-      <w:proofErr w:type="gramEnd"/>
+        <w:t xml:space="preserve">application </w:t>
+      </w:r>
+      <w:proofErr w:type="gramStart"/>
       <w:r>
         <w:rPr>
           <w:rStyle w:val="Internetovodkaz"/>
@@ -923,10 +831,32 @@
           <w:u w:val="none"/>
           <w:lang w:eastAsia="zh-CN"/>
         </w:rPr>
-        <w:t xml:space="preserve"> interface  – </w:t>
-      </w:r>
-      <w:r>
-        <w:t xml:space="preserve">communication point where one part of a system communicates with another in order to service an application </w:t>
+        <w:t>interface  –</w:t>
+      </w:r>
+      <w:proofErr w:type="gramEnd"/>
+      <w:r>
+        <w:rPr>
+          <w:rStyle w:val="Internetovodkaz"/>
+          <w:rFonts w:eastAsia="Calibri" w:cs="Arial"/>
+          <w:b/>
+          <w:bCs/>
+          <w:color w:val="000000"/>
+          <w:kern w:val="2"/>
+          <w:u w:val="none"/>
+          <w:lang w:eastAsia="zh-CN"/>
+        </w:rPr>
+        <w:t xml:space="preserve"> </w:t>
+      </w:r>
+      <w:r>
+        <w:t xml:space="preserve">communication point where one part of a system communicates with another </w:t>
+      </w:r>
+      <w:proofErr w:type="gramStart"/>
+      <w:r>
+        <w:t>in order to</w:t>
+      </w:r>
+      <w:proofErr w:type="gramEnd"/>
+      <w:r>
+        <w:t xml:space="preserve"> service an application </w:t>
       </w:r>
       <w:r>
         <w:rPr>
@@ -1076,7 +1006,7 @@
     </w:p>
     <w:p>
       <w:pPr>
-        <w:pStyle w:val="Nadpis1"/>
+        <w:pStyle w:val="Heading1"/>
       </w:pPr>
       <w:bookmarkStart w:id="31" w:name="_Toc473558468"/>
       <w:bookmarkStart w:id="32" w:name="_Toc4487255"/>
@@ -1134,9 +1064,6 @@
     </w:p>
     <w:p>
       <w:pPr>
-        <w:pStyle w:val="Textnormy"/>
-        <w:suppressAutoHyphens w:val="0"/>
-        <w:spacing w:before="57" w:after="177"/>
         <w:rPr>
           <w:b/>
           <w:sz w:val="22"/>
@@ -1144,27 +1071,18 @@
         </w:rPr>
       </w:pPr>
       <w:r>
-        <w:rPr>
-          <w:color w:val="000000"/>
-        </w:rPr>
         <w:t>The standard contains 35 abbreviations</w:t>
       </w:r>
       <w:r>
-        <w:rPr>
-          <w:color w:val="000000"/>
-        </w:rPr>
         <w:t>; relevant for understanding this</w:t>
       </w:r>
       <w:r>
-        <w:rPr>
-          <w:color w:val="000000"/>
-        </w:rPr>
         <w:t xml:space="preserve"> Extract are:</w:t>
       </w:r>
     </w:p>
     <w:p>
       <w:pPr>
-        <w:pStyle w:val="Zkladntext"/>
+        <w:pStyle w:val="BodyText"/>
       </w:pPr>
       <w:r>
         <w:rPr>
@@ -1191,12 +1109,20 @@
         <w:t>–</w:t>
       </w:r>
       <w:r>
-        <w:t xml:space="preserve"> dedicated short range communication</w:t>
+        <w:t xml:space="preserve"> dedicated </w:t>
+      </w:r>
+      <w:proofErr w:type="gramStart"/>
+      <w:r>
+        <w:t>short range</w:t>
+      </w:r>
+      <w:proofErr w:type="gramEnd"/>
+      <w:r>
+        <w:t xml:space="preserve"> communication</w:t>
       </w:r>
     </w:p>
     <w:p>
       <w:pPr>
-        <w:pStyle w:val="Zkladntext"/>
+        <w:pStyle w:val="BodyText"/>
       </w:pPr>
       <w:r>
         <w:rPr>
@@ -1226,7 +1152,7 @@
     </w:p>
     <w:p>
       <w:pPr>
-        <w:pStyle w:val="Zkladntext"/>
+        <w:pStyle w:val="BodyText"/>
       </w:pPr>
       <w:r>
         <w:rPr>
@@ -1266,7 +1192,7 @@
     </w:p>
     <w:p>
       <w:pPr>
-        <w:pStyle w:val="Zkladntext"/>
+        <w:pStyle w:val="BodyText"/>
       </w:pPr>
       <w:r>
         <w:rPr>
@@ -1318,7 +1244,7 @@
     </w:p>
     <w:p>
       <w:pPr>
-        <w:pStyle w:val="Zkladntext"/>
+        <w:pStyle w:val="BodyText"/>
       </w:pPr>
       <w:r>
         <w:rPr>
@@ -1350,7 +1276,7 @@
     </w:p>
     <w:p>
       <w:pPr>
-        <w:pStyle w:val="Zkladntext"/>
+        <w:pStyle w:val="BodyText"/>
       </w:pPr>
       <w:r>
         <w:rPr>
@@ -1371,7 +1297,7 @@
     </w:p>
     <w:p>
       <w:pPr>
-        <w:pStyle w:val="Zkladntext"/>
+        <w:pStyle w:val="BodyText"/>
       </w:pPr>
       <w:r>
         <w:rPr>
@@ -1402,7 +1328,7 @@
     </w:p>
     <w:p>
       <w:pPr>
-        <w:pStyle w:val="Zkladntext"/>
+        <w:pStyle w:val="BodyText"/>
       </w:pPr>
       <w:r>
         <w:rPr>
@@ -1426,7 +1352,7 @@
     </w:p>
     <w:p>
       <w:pPr>
-        <w:pStyle w:val="Zkladntext"/>
+        <w:pStyle w:val="BodyText"/>
       </w:pPr>
       <w:r>
         <w:rPr>
@@ -1482,7 +1408,7 @@
     </w:p>
     <w:p>
       <w:pPr>
-        <w:pStyle w:val="Zkladntext"/>
+        <w:pStyle w:val="BodyText"/>
       </w:pPr>
       <w:proofErr w:type="gramStart"/>
       <w:r>
@@ -1530,7 +1456,7 @@
     </w:p>
     <w:p>
       <w:pPr>
-        <w:pStyle w:val="Zkladntext"/>
+        <w:pStyle w:val="BodyText"/>
       </w:pPr>
       <w:r>
         <w:rPr>
@@ -1636,15 +1562,7 @@
     </w:p>
     <w:p>
       <w:r>
-        <w:t xml:space="preserve">NOTE: Other terms and abbreviations from the ITS domain can be found in the </w:t>
-      </w:r>
-      <w:proofErr w:type="spellStart"/>
-      <w:r>
-        <w:t>ITSTerminology</w:t>
-      </w:r>
-      <w:proofErr w:type="spellEnd"/>
-      <w:r>
-        <w:t xml:space="preserve"> dictionary (</w:t>
+        <w:t>NOTE: Other terms and abbreviations from the ITS domain can be found in the ITSTerminology dictionary (</w:t>
       </w:r>
       <w:hyperlink r:id="rId13">
         <w:r>
@@ -1702,7 +1620,7 @@
     </w:p>
     <w:p>
       <w:pPr>
-        <w:pStyle w:val="Nadpis1"/>
+        <w:pStyle w:val="Heading1"/>
         <w:rPr>
           <w:color w:val="FF0000"/>
         </w:rPr>
@@ -1727,148 +1645,66 @@
       </w:r>
     </w:p>
     <w:p>
-      <w:pPr>
-        <w:pStyle w:val="Textnormy"/>
-        <w:suppressAutoHyphens w:val="0"/>
-        <w:rPr>
-          <w:color w:val="000000"/>
-        </w:rPr>
-      </w:pPr>
-      <w:r>
-        <w:rPr>
-          <w:color w:val="000000"/>
-        </w:rPr>
+      <w:r>
         <w:t>Clause</w:t>
       </w:r>
       <w:r>
-        <w:rPr>
-          <w:color w:val="000000"/>
-        </w:rPr>
         <w:t xml:space="preserve"> 5 is about half a page long</w:t>
       </w:r>
       <w:r>
-        <w:rPr>
-          <w:color w:val="000000"/>
-        </w:rPr>
         <w:t>. It refers back to the context</w:t>
       </w:r>
       <w:r>
-        <w:rPr>
-          <w:color w:val="000000"/>
-        </w:rPr>
         <w:t xml:space="preserve"> information provided in </w:t>
       </w:r>
       <w:r>
-        <w:rPr>
-          <w:color w:val="000000"/>
-        </w:rPr>
         <w:t>ISO 26683-1.</w:t>
       </w:r>
       <w:r>
-        <w:rPr>
-          <w:color w:val="000000"/>
-        </w:rPr>
         <w:t xml:space="preserve"> The document</w:t>
       </w:r>
       <w:r>
-        <w:rPr>
-          <w:color w:val="000000"/>
-        </w:rPr>
         <w:t xml:space="preserve"> described</w:t>
       </w:r>
       <w:r>
-        <w:rPr>
-          <w:color w:val="000000"/>
-        </w:rPr>
         <w:t xml:space="preserve"> focuses on interface profiles for data transmission. All profiles are optional/voluntary, and when applied in accordance with the </w:t>
       </w:r>
       <w:r>
-        <w:rPr>
-          <w:color w:val="000000"/>
-        </w:rPr>
         <w:t>document described</w:t>
       </w:r>
       <w:r>
-        <w:rPr>
-          <w:color w:val="000000"/>
-        </w:rPr>
         <w:t>, they provide a basis for interoperability.</w:t>
       </w:r>
     </w:p>
     <w:p>
-      <w:pPr>
-        <w:pStyle w:val="Textnormy"/>
-        <w:suppressAutoHyphens w:val="0"/>
-        <w:rPr>
-          <w:color w:val="000000"/>
-        </w:rPr>
-      </w:pPr>
-      <w:r>
-        <w:rPr>
-          <w:color w:val="000000"/>
-        </w:rPr>
-        <w:t xml:space="preserve">A brief overview of data transmission is provided in the following </w:t>
-      </w:r>
-      <w:proofErr w:type="spellStart"/>
-      <w:r>
-        <w:rPr>
-          <w:color w:val="000000"/>
-        </w:rPr>
-        <w:t>subclauses</w:t>
-      </w:r>
-      <w:proofErr w:type="spellEnd"/>
-      <w:r>
-        <w:rPr>
-          <w:color w:val="000000"/>
-        </w:rPr>
-        <w:t>:</w:t>
-      </w:r>
-      <w:r>
-        <w:rPr>
-          <w:color w:val="000000"/>
-        </w:rPr>
+      <w:r>
+        <w:t>A brief overview of data transmission is provided in the following subclauses:</w:t>
+      </w:r>
+      <w:r>
         <w:t xml:space="preserve"> </w:t>
       </w:r>
       <w:r>
-        <w:rPr>
-          <w:color w:val="000000"/>
-        </w:rPr>
         <w:t>5.2 Transfer of data from tags to interrogators (Profile Level 3)</w:t>
       </w:r>
       <w:r>
-        <w:rPr>
-          <w:color w:val="000000"/>
-        </w:rPr>
         <w:t xml:space="preserve">; </w:t>
       </w:r>
       <w:r>
-        <w:rPr>
-          <w:color w:val="000000"/>
-        </w:rPr>
         <w:t>5.3 Transfer of data from trailers to OBE (Profile Level 2)</w:t>
       </w:r>
       <w:r>
-        <w:rPr>
-          <w:color w:val="000000"/>
-        </w:rPr>
         <w:t xml:space="preserve">; </w:t>
       </w:r>
       <w:r>
-        <w:rPr>
-          <w:color w:val="000000"/>
-        </w:rPr>
         <w:t>5.4 Transfer of data from OBE to infrastructure (Profile Level 1)</w:t>
       </w:r>
       <w:r>
-        <w:rPr>
-          <w:color w:val="000000"/>
-        </w:rPr>
         <w:t>.</w:t>
       </w:r>
     </w:p>
     <w:p>
       <w:pPr>
-        <w:pStyle w:val="Nadpis1"/>
+        <w:pStyle w:val="Heading1"/>
         <w:rPr>
           <w:color w:val="FF0000"/>
         </w:rPr>
@@ -1905,30 +1741,16 @@
       </w:r>
     </w:p>
     <w:p>
-      <w:pPr>
-        <w:pStyle w:val="Textnormy"/>
-        <w:suppressAutoHyphens w:val="0"/>
-        <w:spacing w:after="6"/>
-        <w:rPr>
-          <w:color w:val="000000"/>
-        </w:rPr>
-      </w:pPr>
-      <w:r>
-        <w:rPr>
-          <w:color w:val="000000"/>
-        </w:rPr>
+      <w:r>
         <w:t>Clause</w:t>
       </w:r>
       <w:r>
-        <w:rPr>
-          <w:color w:val="000000"/>
-        </w:rPr>
         <w:t xml:space="preserve"> 6, comprising 32 pages, forms the core of the document. It provides a detailed description of the communication levels and the corresponding individual application interface profiles associated with each level.</w:t>
       </w:r>
     </w:p>
     <w:p>
       <w:pPr>
-        <w:pStyle w:val="Nadpis2"/>
+        <w:pStyle w:val="Heading2"/>
         <w:rPr>
           <w:color w:val="003366"/>
         </w:rPr>
@@ -1937,13 +1759,12 @@
         <w:rPr>
           <w:color w:val="003366"/>
         </w:rPr>
-        <w:lastRenderedPageBreak/>
         <w:t>6.1 General</w:t>
       </w:r>
     </w:p>
     <w:p>
       <w:pPr>
-        <w:pStyle w:val="Zkladntext"/>
+        <w:pStyle w:val="BodyText"/>
         <w:rPr>
           <w:color w:val="FF0000"/>
         </w:rPr>
@@ -1953,13 +1774,13 @@
       </w:r>
       <w:r>
         <w:rPr>
-          <w:rStyle w:val="Zdraznn"/>
+          <w:rStyle w:val="Emphasis"/>
         </w:rPr>
         <w:t>“provides interoperability where a communication medium has been selected and is in compliance with one or more of the standards referenced in Annex A of ISO 26683</w:t>
       </w:r>
       <w:r>
         <w:rPr>
-          <w:rStyle w:val="Zdraznn"/>
+          <w:rStyle w:val="Emphasis"/>
         </w:rPr>
         <w:noBreakHyphen/>
         <w:t>1.”</w:t>
@@ -1984,7 +1805,7 @@
     </w:p>
     <w:p>
       <w:pPr>
-        <w:pStyle w:val="Nadpis2"/>
+        <w:pStyle w:val="Heading2"/>
         <w:rPr>
           <w:color w:val="003366"/>
         </w:rPr>
@@ -2075,6 +1896,7 @@
         <w:rPr>
           <w:color w:val="000000"/>
         </w:rPr>
+        <w:lastRenderedPageBreak/>
         <w:t>Level 3 (L3): from the item (incl. item sensors) to the interrogator/OBE of the trailer</w:t>
       </w:r>
     </w:p>
@@ -2180,7 +2002,7 @@
     </w:p>
     <w:p>
       <w:pPr>
-        <w:pStyle w:val="Nadpis2"/>
+        <w:pStyle w:val="Heading2"/>
         <w:rPr>
           <w:color w:val="003366"/>
         </w:rPr>
@@ -2224,7 +2046,7 @@
     </w:p>
     <w:p>
       <w:pPr>
-        <w:pStyle w:val="Nadpis2"/>
+        <w:pStyle w:val="Heading2"/>
         <w:rPr>
           <w:color w:val="003366"/>
         </w:rPr>
@@ -2269,7 +2091,7 @@
     </w:p>
     <w:p>
       <w:pPr>
-        <w:pStyle w:val="Nadpis2"/>
+        <w:pStyle w:val="Heading2"/>
         <w:rPr>
           <w:color w:val="003366"/>
         </w:rPr>
@@ -2373,7 +2195,7 @@
     </w:p>
     <w:p>
       <w:pPr>
-        <w:pStyle w:val="Nadpis2"/>
+        <w:pStyle w:val="Heading2"/>
         <w:rPr>
           <w:color w:val="003366"/>
         </w:rPr>
@@ -2429,7 +2251,7 @@
     </w:p>
     <w:p>
       <w:pPr>
-        <w:pStyle w:val="Nadpis2"/>
+        <w:pStyle w:val="Heading2"/>
         <w:rPr>
           <w:color w:val="003366"/>
         </w:rPr>
@@ -2566,7 +2388,7 @@
     </w:p>
     <w:p>
       <w:pPr>
-        <w:pStyle w:val="Nadpis2"/>
+        <w:pStyle w:val="Heading2"/>
         <w:rPr>
           <w:color w:val="003366"/>
         </w:rPr>
@@ -2623,7 +2445,7 @@
     </w:p>
     <w:p>
       <w:pPr>
-        <w:pStyle w:val="Nadpis2"/>
+        <w:pStyle w:val="Heading2"/>
         <w:rPr>
           <w:color w:val="003366"/>
         </w:rPr>
@@ -2692,7 +2514,7 @@
         </w:rPr>
         <w:lastRenderedPageBreak/>
         <w:drawing>
-          <wp:inline distT="0" distB="0" distL="0" distR="0">
+          <wp:inline distT="0" distB="0" distL="0" distR="0" wp14:anchorId="73D0FCE6" wp14:editId="3382EA95">
             <wp:extent cx="6247130" cy="2153920"/>
             <wp:effectExtent l="0" t="0" r="0" b="0"/>
             <wp:docPr id="1" name="Obrázek2"/>
@@ -2751,25 +2573,8 @@
         <w:t>containers with items monitored by sensors</w:t>
       </w:r>
       <w:r>
-        <w:t xml:space="preserve"> (</w:t>
-      </w:r>
-      <w:r>
-        <w:t>Fig</w:t>
-      </w:r>
-      <w:r>
-        <w:t xml:space="preserve">. 7 of </w:t>
-      </w:r>
-      <w:r>
-        <w:t xml:space="preserve">the </w:t>
-      </w:r>
-      <w:r>
-        <w:t xml:space="preserve">source </w:t>
-      </w:r>
-      <w:r>
-        <w:t>standard)</w:t>
-      </w:r>
-      <w:bookmarkStart w:id="65" w:name="_GoBack"/>
-      <w:bookmarkEnd w:id="65"/>
+        <w:t xml:space="preserve"> (Fig. 7 of the source standard)</w:t>
+      </w:r>
     </w:p>
     <w:p>
       <w:pPr>
@@ -2783,7 +2588,7 @@
     </w:p>
     <w:p>
       <w:pPr>
-        <w:pStyle w:val="Nadpis2"/>
+        <w:pStyle w:val="Heading2"/>
         <w:rPr>
           <w:color w:val="003366"/>
         </w:rPr>
@@ -2813,7 +2618,7 @@
     </w:p>
     <w:p>
       <w:pPr>
-        <w:pStyle w:val="Nadpis2"/>
+        <w:pStyle w:val="Heading2"/>
       </w:pPr>
       <w:r>
         <w:t xml:space="preserve">6.11 FLC-CIC </w:t>
@@ -2866,7 +2671,7 @@
     </w:p>
     <w:p>
       <w:pPr>
-        <w:pStyle w:val="Nadpis2"/>
+        <w:pStyle w:val="Heading2"/>
         <w:rPr>
           <w:color w:val="003366"/>
         </w:rPr>
@@ -2929,7 +2734,7 @@
     </w:p>
     <w:p>
       <w:pPr>
-        <w:pStyle w:val="Nadpis2"/>
+        <w:pStyle w:val="Heading2"/>
         <w:rPr>
           <w:color w:val="003366"/>
         </w:rPr>
@@ -3004,7 +2809,7 @@
     </w:p>
     <w:p>
       <w:pPr>
-        <w:pStyle w:val="Nadpis1"/>
+        <w:pStyle w:val="Heading1"/>
       </w:pPr>
       <w:r>
         <w:t>Clause</w:t>
@@ -3035,7 +2840,7 @@
     </w:p>
     <w:p>
       <w:pPr>
-        <w:pStyle w:val="Nadpis1"/>
+        <w:pStyle w:val="Heading1"/>
       </w:pPr>
       <w:r>
         <w:t>Clause</w:t>
@@ -3046,7 +2851,7 @@
     </w:p>
     <w:p>
       <w:pPr>
-        <w:pStyle w:val="Nadpis1"/>
+        <w:pStyle w:val="Heading1"/>
       </w:pPr>
       <w:r>
         <w:t>Clause</w:t>
@@ -3057,7 +2862,7 @@
     </w:p>
     <w:p>
       <w:pPr>
-        <w:pStyle w:val="Nadpis1"/>
+        <w:pStyle w:val="Heading1"/>
       </w:pPr>
       <w:r>
         <w:t>Clause</w:t>
@@ -3068,7 +2873,7 @@
     </w:p>
     <w:p>
       <w:pPr>
-        <w:pStyle w:val="Nadpis1"/>
+        <w:pStyle w:val="Heading1"/>
       </w:pPr>
       <w:r>
         <w:t>Clause</w:t>
@@ -3082,7 +2887,7 @@
         <w:pStyle w:val="Textnormy"/>
         <w:suppressAutoHyphens w:val="0"/>
         <w:rPr>
-          <w:rStyle w:val="Siln"/>
+          <w:rStyle w:val="Strong"/>
         </w:rPr>
       </w:pPr>
     </w:p>
@@ -3109,7 +2914,7 @@
 </file>
 
 <file path=word/endnotes.xml><?xml version="1.0" encoding="utf-8"?>
-<w:endnotes xmlns:wpc="http://schemas.microsoft.com/office/word/2010/wordprocessingCanvas" xmlns:cx="http://schemas.microsoft.com/office/drawing/2014/chartex" xmlns:cx1="http://schemas.microsoft.com/office/drawing/2015/9/8/chartex" xmlns:mc="http://schemas.openxmlformats.org/markup-compatibility/2006" xmlns:o="urn:schemas-microsoft-com:office:office" xmlns:r="http://schemas.openxmlformats.org/officeDocument/2006/relationships" xmlns:m="http://schemas.openxmlformats.org/officeDocument/2006/math" xmlns:v="urn:schemas-microsoft-com:vml" xmlns:wp14="http://schemas.microsoft.com/office/word/2010/wordprocessingDrawing" xmlns:wp="http://schemas.openxmlformats.org/drawingml/2006/wordprocessingDrawing" xmlns:w10="urn:schemas-microsoft-com:office:word" xmlns:w="http://schemas.openxmlformats.org/wordprocessingml/2006/main" xmlns:w14="http://schemas.microsoft.com/office/word/2010/wordml" xmlns:w15="http://schemas.microsoft.com/office/word/2012/wordml" xmlns:w16se="http://schemas.microsoft.com/office/word/2015/wordml/symex" xmlns:wpg="http://schemas.microsoft.com/office/word/2010/wordprocessingGroup" xmlns:wpi="http://schemas.microsoft.com/office/word/2010/wordprocessingInk" xmlns:wne="http://schemas.microsoft.com/office/word/2006/wordml" xmlns:wps="http://schemas.microsoft.com/office/word/2010/wordprocessingShape" mc:Ignorable="w14 w15 w16se wp14">
+<w:endnotes xmlns:wpc="http://schemas.microsoft.com/office/word/2010/wordprocessingCanvas" xmlns:cx="http://schemas.microsoft.com/office/drawing/2014/chartex" xmlns:cx1="http://schemas.microsoft.com/office/drawing/2015/9/8/chartex" xmlns:cx2="http://schemas.microsoft.com/office/drawing/2015/10/21/chartex" xmlns:cx3="http://schemas.microsoft.com/office/drawing/2016/5/9/chartex" xmlns:cx4="http://schemas.microsoft.com/office/drawing/2016/5/10/chartex" xmlns:cx5="http://schemas.microsoft.com/office/drawing/2016/5/11/chartex" xmlns:cx6="http://schemas.microsoft.com/office/drawing/2016/5/12/chartex" xmlns:cx7="http://schemas.microsoft.com/office/drawing/2016/5/13/chartex" xmlns:cx8="http://schemas.microsoft.com/office/drawing/2016/5/14/chartex" xmlns:mc="http://schemas.openxmlformats.org/markup-compatibility/2006" xmlns:aink="http://schemas.microsoft.com/office/drawing/2016/ink" xmlns:am3d="http://schemas.microsoft.com/office/drawing/2017/model3d" xmlns:o="urn:schemas-microsoft-com:office:office" xmlns:oel="http://schemas.microsoft.com/office/2019/extlst" xmlns:r="http://schemas.openxmlformats.org/officeDocument/2006/relationships" xmlns:m="http://schemas.openxmlformats.org/officeDocument/2006/math" xmlns:v="urn:schemas-microsoft-com:vml" xmlns:wp14="http://schemas.microsoft.com/office/word/2010/wordprocessingDrawing" xmlns:wp="http://schemas.openxmlformats.org/drawingml/2006/wordprocessingDrawing" xmlns:w10="urn:schemas-microsoft-com:office:word" xmlns:w="http://schemas.openxmlformats.org/wordprocessingml/2006/main" xmlns:w14="http://schemas.microsoft.com/office/word/2010/wordml" xmlns:w15="http://schemas.microsoft.com/office/word/2012/wordml" xmlns:w16cex="http://schemas.microsoft.com/office/word/2018/wordml/cex" xmlns:w16cid="http://schemas.microsoft.com/office/word/2016/wordml/cid" xmlns:w16="http://schemas.microsoft.com/office/word/2018/wordml" xmlns:w16du="http://schemas.microsoft.com/office/word/2023/wordml/word16du" xmlns:w16sdtdh="http://schemas.microsoft.com/office/word/2020/wordml/sdtdatahash" xmlns:w16sdtfl="http://schemas.microsoft.com/office/word/2024/wordml/sdtformatlock" xmlns:w16se="http://schemas.microsoft.com/office/word/2015/wordml/symex" xmlns:wpg="http://schemas.microsoft.com/office/word/2010/wordprocessingGroup" xmlns:wpi="http://schemas.microsoft.com/office/word/2010/wordprocessingInk" xmlns:wne="http://schemas.microsoft.com/office/word/2006/wordml" xmlns:wps="http://schemas.microsoft.com/office/word/2010/wordprocessingShape" mc:Ignorable="w14 w15 w16se w16cid w16 w16cex w16sdtdh w16sdtfl w16du wp14">
   <w:endnote w:type="separator" w:id="-1">
     <w:p>
       <w:r>
@@ -3128,40 +2933,40 @@
 </file>
 
 <file path=word/footer1.xml><?xml version="1.0" encoding="utf-8"?>
-<w:ftr xmlns:wpc="http://schemas.microsoft.com/office/word/2010/wordprocessingCanvas" xmlns:cx="http://schemas.microsoft.com/office/drawing/2014/chartex" xmlns:cx1="http://schemas.microsoft.com/office/drawing/2015/9/8/chartex" xmlns:mc="http://schemas.openxmlformats.org/markup-compatibility/2006" xmlns:o="urn:schemas-microsoft-com:office:office" xmlns:r="http://schemas.openxmlformats.org/officeDocument/2006/relationships" xmlns:m="http://schemas.openxmlformats.org/officeDocument/2006/math" xmlns:v="urn:schemas-microsoft-com:vml" xmlns:wp14="http://schemas.microsoft.com/office/word/2010/wordprocessingDrawing" xmlns:wp="http://schemas.openxmlformats.org/drawingml/2006/wordprocessingDrawing" xmlns:w10="urn:schemas-microsoft-com:office:word" xmlns:w="http://schemas.openxmlformats.org/wordprocessingml/2006/main" xmlns:w14="http://schemas.microsoft.com/office/word/2010/wordml" xmlns:w15="http://schemas.microsoft.com/office/word/2012/wordml" xmlns:w16se="http://schemas.microsoft.com/office/word/2015/wordml/symex" xmlns:wpg="http://schemas.microsoft.com/office/word/2010/wordprocessingGroup" xmlns:wpi="http://schemas.microsoft.com/office/word/2010/wordprocessingInk" xmlns:wne="http://schemas.microsoft.com/office/word/2006/wordml" xmlns:wps="http://schemas.microsoft.com/office/word/2010/wordprocessingShape" mc:Ignorable="w14 w15 w16se wp14">
+<w:ftr xmlns:wpc="http://schemas.microsoft.com/office/word/2010/wordprocessingCanvas" xmlns:cx="http://schemas.microsoft.com/office/drawing/2014/chartex" xmlns:cx1="http://schemas.microsoft.com/office/drawing/2015/9/8/chartex" xmlns:cx2="http://schemas.microsoft.com/office/drawing/2015/10/21/chartex" xmlns:cx3="http://schemas.microsoft.com/office/drawing/2016/5/9/chartex" xmlns:cx4="http://schemas.microsoft.com/office/drawing/2016/5/10/chartex" xmlns:cx5="http://schemas.microsoft.com/office/drawing/2016/5/11/chartex" xmlns:cx6="http://schemas.microsoft.com/office/drawing/2016/5/12/chartex" xmlns:cx7="http://schemas.microsoft.com/office/drawing/2016/5/13/chartex" xmlns:cx8="http://schemas.microsoft.com/office/drawing/2016/5/14/chartex" xmlns:mc="http://schemas.openxmlformats.org/markup-compatibility/2006" xmlns:aink="http://schemas.microsoft.com/office/drawing/2016/ink" xmlns:am3d="http://schemas.microsoft.com/office/drawing/2017/model3d" xmlns:o="urn:schemas-microsoft-com:office:office" xmlns:oel="http://schemas.microsoft.com/office/2019/extlst" xmlns:r="http://schemas.openxmlformats.org/officeDocument/2006/relationships" xmlns:m="http://schemas.openxmlformats.org/officeDocument/2006/math" xmlns:v="urn:schemas-microsoft-com:vml" xmlns:wp14="http://schemas.microsoft.com/office/word/2010/wordprocessingDrawing" xmlns:wp="http://schemas.openxmlformats.org/drawingml/2006/wordprocessingDrawing" xmlns:w10="urn:schemas-microsoft-com:office:word" xmlns:w="http://schemas.openxmlformats.org/wordprocessingml/2006/main" xmlns:w14="http://schemas.microsoft.com/office/word/2010/wordml" xmlns:w15="http://schemas.microsoft.com/office/word/2012/wordml" xmlns:w16cex="http://schemas.microsoft.com/office/word/2018/wordml/cex" xmlns:w16cid="http://schemas.microsoft.com/office/word/2016/wordml/cid" xmlns:w16="http://schemas.microsoft.com/office/word/2018/wordml" xmlns:w16du="http://schemas.microsoft.com/office/word/2023/wordml/word16du" xmlns:w16sdtdh="http://schemas.microsoft.com/office/word/2020/wordml/sdtdatahash" xmlns:w16sdtfl="http://schemas.microsoft.com/office/word/2024/wordml/sdtformatlock" xmlns:w16se="http://schemas.microsoft.com/office/word/2015/wordml/symex" xmlns:wpg="http://schemas.microsoft.com/office/word/2010/wordprocessingGroup" xmlns:wpi="http://schemas.microsoft.com/office/word/2010/wordprocessingInk" xmlns:wne="http://schemas.microsoft.com/office/word/2006/wordml" xmlns:wps="http://schemas.microsoft.com/office/word/2010/wordprocessingShape" mc:Ignorable="w14 w15 w16se w16cid w16 w16cex w16sdtdh w16sdtfl w16du wp14">
   <w:p>
     <w:pPr>
-      <w:pStyle w:val="Zpat"/>
+      <w:pStyle w:val="Footer"/>
       <w:ind w:right="360" w:firstLine="360"/>
     </w:pPr>
     <w:r>
       <w:rPr>
-        <w:rStyle w:val="slostrnky"/>
+        <w:rStyle w:val="PageNumber"/>
       </w:rPr>
       <w:fldChar w:fldCharType="begin"/>
     </w:r>
     <w:r>
       <w:rPr>
-        <w:rStyle w:val="slostrnky"/>
+        <w:rStyle w:val="PageNumber"/>
       </w:rPr>
       <w:instrText>PAGE</w:instrText>
     </w:r>
     <w:r>
       <w:rPr>
-        <w:rStyle w:val="slostrnky"/>
+        <w:rStyle w:val="PageNumber"/>
       </w:rPr>
       <w:fldChar w:fldCharType="separate"/>
     </w:r>
     <w:r>
       <w:rPr>
-        <w:rStyle w:val="slostrnky"/>
+        <w:rStyle w:val="PageNumber"/>
         <w:noProof/>
       </w:rPr>
       <w:t>2</w:t>
     </w:r>
     <w:r>
       <w:rPr>
-        <w:rStyle w:val="slostrnky"/>
+        <w:rStyle w:val="PageNumber"/>
       </w:rPr>
       <w:fldChar w:fldCharType="end"/>
     </w:r>
@@ -3170,40 +2975,40 @@
 </file>
 
 <file path=word/footer2.xml><?xml version="1.0" encoding="utf-8"?>
-<w:ftr xmlns:wpc="http://schemas.microsoft.com/office/word/2010/wordprocessingCanvas" xmlns:cx="http://schemas.microsoft.com/office/drawing/2014/chartex" xmlns:cx1="http://schemas.microsoft.com/office/drawing/2015/9/8/chartex" xmlns:mc="http://schemas.openxmlformats.org/markup-compatibility/2006" xmlns:o="urn:schemas-microsoft-com:office:office" xmlns:r="http://schemas.openxmlformats.org/officeDocument/2006/relationships" xmlns:m="http://schemas.openxmlformats.org/officeDocument/2006/math" xmlns:v="urn:schemas-microsoft-com:vml" xmlns:wp14="http://schemas.microsoft.com/office/word/2010/wordprocessingDrawing" xmlns:wp="http://schemas.openxmlformats.org/drawingml/2006/wordprocessingDrawing" xmlns:w10="urn:schemas-microsoft-com:office:word" xmlns:w="http://schemas.openxmlformats.org/wordprocessingml/2006/main" xmlns:w14="http://schemas.microsoft.com/office/word/2010/wordml" xmlns:w15="http://schemas.microsoft.com/office/word/2012/wordml" xmlns:w16se="http://schemas.microsoft.com/office/word/2015/wordml/symex" xmlns:wpg="http://schemas.microsoft.com/office/word/2010/wordprocessingGroup" xmlns:wpi="http://schemas.microsoft.com/office/word/2010/wordprocessingInk" xmlns:wne="http://schemas.microsoft.com/office/word/2006/wordml" xmlns:wps="http://schemas.microsoft.com/office/word/2010/wordprocessingShape" mc:Ignorable="w14 w15 w16se wp14">
+<w:ftr xmlns:wpc="http://schemas.microsoft.com/office/word/2010/wordprocessingCanvas" xmlns:cx="http://schemas.microsoft.com/office/drawing/2014/chartex" xmlns:cx1="http://schemas.microsoft.com/office/drawing/2015/9/8/chartex" xmlns:cx2="http://schemas.microsoft.com/office/drawing/2015/10/21/chartex" xmlns:cx3="http://schemas.microsoft.com/office/drawing/2016/5/9/chartex" xmlns:cx4="http://schemas.microsoft.com/office/drawing/2016/5/10/chartex" xmlns:cx5="http://schemas.microsoft.com/office/drawing/2016/5/11/chartex" xmlns:cx6="http://schemas.microsoft.com/office/drawing/2016/5/12/chartex" xmlns:cx7="http://schemas.microsoft.com/office/drawing/2016/5/13/chartex" xmlns:cx8="http://schemas.microsoft.com/office/drawing/2016/5/14/chartex" xmlns:mc="http://schemas.openxmlformats.org/markup-compatibility/2006" xmlns:aink="http://schemas.microsoft.com/office/drawing/2016/ink" xmlns:am3d="http://schemas.microsoft.com/office/drawing/2017/model3d" xmlns:o="urn:schemas-microsoft-com:office:office" xmlns:oel="http://schemas.microsoft.com/office/2019/extlst" xmlns:r="http://schemas.openxmlformats.org/officeDocument/2006/relationships" xmlns:m="http://schemas.openxmlformats.org/officeDocument/2006/math" xmlns:v="urn:schemas-microsoft-com:vml" xmlns:wp14="http://schemas.microsoft.com/office/word/2010/wordprocessingDrawing" xmlns:wp="http://schemas.openxmlformats.org/drawingml/2006/wordprocessingDrawing" xmlns:w10="urn:schemas-microsoft-com:office:word" xmlns:w="http://schemas.openxmlformats.org/wordprocessingml/2006/main" xmlns:w14="http://schemas.microsoft.com/office/word/2010/wordml" xmlns:w15="http://schemas.microsoft.com/office/word/2012/wordml" xmlns:w16cex="http://schemas.microsoft.com/office/word/2018/wordml/cex" xmlns:w16cid="http://schemas.microsoft.com/office/word/2016/wordml/cid" xmlns:w16="http://schemas.microsoft.com/office/word/2018/wordml" xmlns:w16du="http://schemas.microsoft.com/office/word/2023/wordml/word16du" xmlns:w16sdtdh="http://schemas.microsoft.com/office/word/2020/wordml/sdtdatahash" xmlns:w16sdtfl="http://schemas.microsoft.com/office/word/2024/wordml/sdtformatlock" xmlns:w16se="http://schemas.microsoft.com/office/word/2015/wordml/symex" xmlns:wpg="http://schemas.microsoft.com/office/word/2010/wordprocessingGroup" xmlns:wpi="http://schemas.microsoft.com/office/word/2010/wordprocessingInk" xmlns:wne="http://schemas.microsoft.com/office/word/2006/wordml" xmlns:wps="http://schemas.microsoft.com/office/word/2010/wordprocessingShape" mc:Ignorable="w14 w15 w16se w16cid w16 w16cex w16sdtdh w16sdtfl w16du wp14">
   <w:p>
     <w:pPr>
-      <w:pStyle w:val="Zpat"/>
+      <w:pStyle w:val="Footer"/>
       <w:ind w:right="360" w:firstLine="360"/>
     </w:pPr>
     <w:r>
       <w:rPr>
-        <w:rStyle w:val="slostrnky"/>
+        <w:rStyle w:val="PageNumber"/>
       </w:rPr>
       <w:fldChar w:fldCharType="begin"/>
     </w:r>
     <w:r>
       <w:rPr>
-        <w:rStyle w:val="slostrnky"/>
+        <w:rStyle w:val="PageNumber"/>
       </w:rPr>
       <w:instrText>PAGE</w:instrText>
     </w:r>
     <w:r>
       <w:rPr>
-        <w:rStyle w:val="slostrnky"/>
+        <w:rStyle w:val="PageNumber"/>
       </w:rPr>
       <w:fldChar w:fldCharType="separate"/>
     </w:r>
     <w:r>
       <w:rPr>
-        <w:rStyle w:val="slostrnky"/>
+        <w:rStyle w:val="PageNumber"/>
         <w:noProof/>
       </w:rPr>
       <w:t>3</w:t>
     </w:r>
     <w:r>
       <w:rPr>
-        <w:rStyle w:val="slostrnky"/>
+        <w:rStyle w:val="PageNumber"/>
       </w:rPr>
       <w:fldChar w:fldCharType="end"/>
     </w:r>
@@ -3212,7 +3017,7 @@
 </file>
 
 <file path=word/footnotes.xml><?xml version="1.0" encoding="utf-8"?>
-<w:footnotes xmlns:wpc="http://schemas.microsoft.com/office/word/2010/wordprocessingCanvas" xmlns:cx="http://schemas.microsoft.com/office/drawing/2014/chartex" xmlns:cx1="http://schemas.microsoft.com/office/drawing/2015/9/8/chartex" xmlns:mc="http://schemas.openxmlformats.org/markup-compatibility/2006" xmlns:o="urn:schemas-microsoft-com:office:office" xmlns:r="http://schemas.openxmlformats.org/officeDocument/2006/relationships" xmlns:m="http://schemas.openxmlformats.org/officeDocument/2006/math" xmlns:v="urn:schemas-microsoft-com:vml" xmlns:wp14="http://schemas.microsoft.com/office/word/2010/wordprocessingDrawing" xmlns:wp="http://schemas.openxmlformats.org/drawingml/2006/wordprocessingDrawing" xmlns:w10="urn:schemas-microsoft-com:office:word" xmlns:w="http://schemas.openxmlformats.org/wordprocessingml/2006/main" xmlns:w14="http://schemas.microsoft.com/office/word/2010/wordml" xmlns:w15="http://schemas.microsoft.com/office/word/2012/wordml" xmlns:w16se="http://schemas.microsoft.com/office/word/2015/wordml/symex" xmlns:wpg="http://schemas.microsoft.com/office/word/2010/wordprocessingGroup" xmlns:wpi="http://schemas.microsoft.com/office/word/2010/wordprocessingInk" xmlns:wne="http://schemas.microsoft.com/office/word/2006/wordml" xmlns:wps="http://schemas.microsoft.com/office/word/2010/wordprocessingShape" mc:Ignorable="w14 w15 w16se wp14">
+<w:footnotes xmlns:wpc="http://schemas.microsoft.com/office/word/2010/wordprocessingCanvas" xmlns:cx="http://schemas.microsoft.com/office/drawing/2014/chartex" xmlns:cx1="http://schemas.microsoft.com/office/drawing/2015/9/8/chartex" xmlns:cx2="http://schemas.microsoft.com/office/drawing/2015/10/21/chartex" xmlns:cx3="http://schemas.microsoft.com/office/drawing/2016/5/9/chartex" xmlns:cx4="http://schemas.microsoft.com/office/drawing/2016/5/10/chartex" xmlns:cx5="http://schemas.microsoft.com/office/drawing/2016/5/11/chartex" xmlns:cx6="http://schemas.microsoft.com/office/drawing/2016/5/12/chartex" xmlns:cx7="http://schemas.microsoft.com/office/drawing/2016/5/13/chartex" xmlns:cx8="http://schemas.microsoft.com/office/drawing/2016/5/14/chartex" xmlns:mc="http://schemas.openxmlformats.org/markup-compatibility/2006" xmlns:aink="http://schemas.microsoft.com/office/drawing/2016/ink" xmlns:am3d="http://schemas.microsoft.com/office/drawing/2017/model3d" xmlns:o="urn:schemas-microsoft-com:office:office" xmlns:oel="http://schemas.microsoft.com/office/2019/extlst" xmlns:r="http://schemas.openxmlformats.org/officeDocument/2006/relationships" xmlns:m="http://schemas.openxmlformats.org/officeDocument/2006/math" xmlns:v="urn:schemas-microsoft-com:vml" xmlns:wp14="http://schemas.microsoft.com/office/word/2010/wordprocessingDrawing" xmlns:wp="http://schemas.openxmlformats.org/drawingml/2006/wordprocessingDrawing" xmlns:w10="urn:schemas-microsoft-com:office:word" xmlns:w="http://schemas.openxmlformats.org/wordprocessingml/2006/main" xmlns:w14="http://schemas.microsoft.com/office/word/2010/wordml" xmlns:w15="http://schemas.microsoft.com/office/word/2012/wordml" xmlns:w16cex="http://schemas.microsoft.com/office/word/2018/wordml/cex" xmlns:w16cid="http://schemas.microsoft.com/office/word/2016/wordml/cid" xmlns:w16="http://schemas.microsoft.com/office/word/2018/wordml" xmlns:w16du="http://schemas.microsoft.com/office/word/2023/wordml/word16du" xmlns:w16sdtdh="http://schemas.microsoft.com/office/word/2020/wordml/sdtdatahash" xmlns:w16sdtfl="http://schemas.microsoft.com/office/word/2024/wordml/sdtformatlock" xmlns:w16se="http://schemas.microsoft.com/office/word/2015/wordml/symex" xmlns:wpg="http://schemas.microsoft.com/office/word/2010/wordprocessingGroup" xmlns:wpi="http://schemas.microsoft.com/office/word/2010/wordprocessingInk" xmlns:wne="http://schemas.microsoft.com/office/word/2006/wordml" xmlns:wps="http://schemas.microsoft.com/office/word/2010/wordprocessingShape" mc:Ignorable="w14 w15 w16se w16cid w16 w16cex w16sdtdh w16sdtfl w16du wp14">
   <w:footnote w:type="separator" w:id="-1">
     <w:p>
       <w:r>
@@ -3231,7 +3036,7 @@
 </file>
 
 <file path=word/numbering.xml><?xml version="1.0" encoding="utf-8"?>
-<w:numbering xmlns:wpc="http://schemas.microsoft.com/office/word/2010/wordprocessingCanvas" xmlns:cx="http://schemas.microsoft.com/office/drawing/2014/chartex" xmlns:cx1="http://schemas.microsoft.com/office/drawing/2015/9/8/chartex" xmlns:mc="http://schemas.openxmlformats.org/markup-compatibility/2006" xmlns:o="urn:schemas-microsoft-com:office:office" xmlns:r="http://schemas.openxmlformats.org/officeDocument/2006/relationships" xmlns:m="http://schemas.openxmlformats.org/officeDocument/2006/math" xmlns:v="urn:schemas-microsoft-com:vml" xmlns:wp14="http://schemas.microsoft.com/office/word/2010/wordprocessingDrawing" xmlns:wp="http://schemas.openxmlformats.org/drawingml/2006/wordprocessingDrawing" xmlns:w10="urn:schemas-microsoft-com:office:word" xmlns:w="http://schemas.openxmlformats.org/wordprocessingml/2006/main" xmlns:w14="http://schemas.microsoft.com/office/word/2010/wordml" xmlns:w15="http://schemas.microsoft.com/office/word/2012/wordml" xmlns:w16se="http://schemas.microsoft.com/office/word/2015/wordml/symex" xmlns:wpg="http://schemas.microsoft.com/office/word/2010/wordprocessingGroup" xmlns:wpi="http://schemas.microsoft.com/office/word/2010/wordprocessingInk" xmlns:wne="http://schemas.microsoft.com/office/word/2006/wordml" xmlns:wps="http://schemas.microsoft.com/office/word/2010/wordprocessingShape" mc:Ignorable="w14 w15 w16se wp14">
+<w:numbering xmlns:wpc="http://schemas.microsoft.com/office/word/2010/wordprocessingCanvas" xmlns:cx="http://schemas.microsoft.com/office/drawing/2014/chartex" xmlns:cx1="http://schemas.microsoft.com/office/drawing/2015/9/8/chartex" xmlns:cx2="http://schemas.microsoft.com/office/drawing/2015/10/21/chartex" xmlns:cx3="http://schemas.microsoft.com/office/drawing/2016/5/9/chartex" xmlns:cx4="http://schemas.microsoft.com/office/drawing/2016/5/10/chartex" xmlns:cx5="http://schemas.microsoft.com/office/drawing/2016/5/11/chartex" xmlns:cx6="http://schemas.microsoft.com/office/drawing/2016/5/12/chartex" xmlns:cx7="http://schemas.microsoft.com/office/drawing/2016/5/13/chartex" xmlns:cx8="http://schemas.microsoft.com/office/drawing/2016/5/14/chartex" xmlns:mc="http://schemas.openxmlformats.org/markup-compatibility/2006" xmlns:aink="http://schemas.microsoft.com/office/drawing/2016/ink" xmlns:am3d="http://schemas.microsoft.com/office/drawing/2017/model3d" xmlns:o="urn:schemas-microsoft-com:office:office" xmlns:oel="http://schemas.microsoft.com/office/2019/extlst" xmlns:r="http://schemas.openxmlformats.org/officeDocument/2006/relationships" xmlns:m="http://schemas.openxmlformats.org/officeDocument/2006/math" xmlns:v="urn:schemas-microsoft-com:vml" xmlns:wp14="http://schemas.microsoft.com/office/word/2010/wordprocessingDrawing" xmlns:wp="http://schemas.openxmlformats.org/drawingml/2006/wordprocessingDrawing" xmlns:w10="urn:schemas-microsoft-com:office:word" xmlns:w="http://schemas.openxmlformats.org/wordprocessingml/2006/main" xmlns:w14="http://schemas.microsoft.com/office/word/2010/wordml" xmlns:w15="http://schemas.microsoft.com/office/word/2012/wordml" xmlns:w16cex="http://schemas.microsoft.com/office/word/2018/wordml/cex" xmlns:w16cid="http://schemas.microsoft.com/office/word/2016/wordml/cid" xmlns:w16="http://schemas.microsoft.com/office/word/2018/wordml" xmlns:w16du="http://schemas.microsoft.com/office/word/2023/wordml/word16du" xmlns:w16sdtdh="http://schemas.microsoft.com/office/word/2020/wordml/sdtdatahash" xmlns:w16sdtfl="http://schemas.microsoft.com/office/word/2024/wordml/sdtformatlock" xmlns:w16se="http://schemas.microsoft.com/office/word/2015/wordml/symex" xmlns:wpg="http://schemas.microsoft.com/office/word/2010/wordprocessingGroup" xmlns:wpi="http://schemas.microsoft.com/office/word/2010/wordprocessingInk" xmlns:wne="http://schemas.microsoft.com/office/word/2006/wordml" xmlns:wps="http://schemas.microsoft.com/office/word/2010/wordprocessingShape" mc:Ignorable="w14 w15 w16se w16cid w16 w16cex w16sdtdh w16sdtfl w16du wp14">
   <w:abstractNum w:abstractNumId="0" w15:restartNumberingAfterBreak="0">
     <w:nsid w:val="022577E5"/>
     <w:multiLevelType w:val="hybridMultilevel"/>
@@ -3934,29 +3739,29 @@
       </w:pPr>
     </w:lvl>
   </w:abstractNum>
-  <w:num w:numId="1">
+  <w:num w:numId="1" w16cid:durableId="1255014948">
     <w:abstractNumId w:val="5"/>
   </w:num>
-  <w:num w:numId="2">
+  <w:num w:numId="2" w16cid:durableId="1377896478">
     <w:abstractNumId w:val="2"/>
   </w:num>
-  <w:num w:numId="3">
+  <w:num w:numId="3" w16cid:durableId="1614048978">
     <w:abstractNumId w:val="4"/>
   </w:num>
-  <w:num w:numId="4">
+  <w:num w:numId="4" w16cid:durableId="816604023">
     <w:abstractNumId w:val="3"/>
   </w:num>
-  <w:num w:numId="5">
+  <w:num w:numId="5" w16cid:durableId="1819104448">
     <w:abstractNumId w:val="0"/>
   </w:num>
-  <w:num w:numId="6">
+  <w:num w:numId="6" w16cid:durableId="757948202">
     <w:abstractNumId w:val="1"/>
   </w:num>
 </w:numbering>
 </file>
 
 <file path=word/styles.xml><?xml version="1.0" encoding="utf-8"?>
-<w:styles xmlns:mc="http://schemas.openxmlformats.org/markup-compatibility/2006" xmlns:r="http://schemas.openxmlformats.org/officeDocument/2006/relationships" xmlns:w="http://schemas.openxmlformats.org/wordprocessingml/2006/main" xmlns:w14="http://schemas.microsoft.com/office/word/2010/wordml" xmlns:w15="http://schemas.microsoft.com/office/word/2012/wordml" xmlns:w16se="http://schemas.microsoft.com/office/word/2015/wordml/symex" mc:Ignorable="w14 w15 w16se">
+<w:styles xmlns:mc="http://schemas.openxmlformats.org/markup-compatibility/2006" xmlns:r="http://schemas.openxmlformats.org/officeDocument/2006/relationships" xmlns:w="http://schemas.openxmlformats.org/wordprocessingml/2006/main" xmlns:w14="http://schemas.microsoft.com/office/word/2010/wordml" xmlns:w15="http://schemas.microsoft.com/office/word/2012/wordml" xmlns:w16cex="http://schemas.microsoft.com/office/word/2018/wordml/cex" xmlns:w16cid="http://schemas.microsoft.com/office/word/2016/wordml/cid" xmlns:w16="http://schemas.microsoft.com/office/word/2018/wordml" xmlns:w16du="http://schemas.microsoft.com/office/word/2023/wordml/word16du" xmlns:w16sdtdh="http://schemas.microsoft.com/office/word/2020/wordml/sdtdatahash" xmlns:w16sdtfl="http://schemas.microsoft.com/office/word/2024/wordml/sdtformatlock" xmlns:w16se="http://schemas.microsoft.com/office/word/2015/wordml/symex" mc:Ignorable="w14 w15 w16se w16cid w16 w16cex w16sdtdh w16sdtfl w16du">
   <w:docDefaults>
     <w:rPrDefault>
       <w:rPr>
@@ -3970,7 +3775,7 @@
       </w:pPr>
     </w:pPrDefault>
   </w:docDefaults>
-  <w:latentStyles w:defLockedState="0" w:defUIPriority="0" w:defSemiHidden="0" w:defUnhideWhenUsed="0" w:defQFormat="0" w:count="371">
+  <w:latentStyles w:defLockedState="0" w:defUIPriority="0" w:defSemiHidden="0" w:defUnhideWhenUsed="0" w:defQFormat="0" w:count="376">
     <w:lsdException w:name="Normal" w:qFormat="1"/>
     <w:lsdException w:name="heading 1" w:uiPriority="99" w:qFormat="1"/>
     <w:lsdException w:name="heading 2" w:qFormat="1"/>
@@ -4335,8 +4140,13 @@
     <w:lsdException w:name="List Table 5 Dark Accent 6" w:uiPriority="50"/>
     <w:lsdException w:name="List Table 6 Colorful Accent 6" w:uiPriority="51"/>
     <w:lsdException w:name="List Table 7 Colorful Accent 6" w:uiPriority="52"/>
+    <w:lsdException w:name="Mention" w:semiHidden="1" w:uiPriority="99" w:unhideWhenUsed="1"/>
+    <w:lsdException w:name="Smart Hyperlink" w:semiHidden="1" w:uiPriority="99" w:unhideWhenUsed="1"/>
+    <w:lsdException w:name="Hashtag" w:semiHidden="1" w:uiPriority="99" w:unhideWhenUsed="1"/>
+    <w:lsdException w:name="Unresolved Mention" w:semiHidden="1" w:uiPriority="99" w:unhideWhenUsed="1"/>
+    <w:lsdException w:name="Smart Link" w:semiHidden="1" w:uiPriority="99" w:unhideWhenUsed="1"/>
   </w:latentStyles>
-  <w:style w:type="paragraph" w:default="1" w:styleId="Normln">
+  <w:style w:type="paragraph" w:default="1" w:styleId="Normal">
     <w:name w:val="Normal"/>
     <w:qFormat/>
     <w:rsid w:val="0027731C"/>
@@ -4354,11 +4164,11 @@
       <w:rFonts w:ascii="Arial" w:hAnsi="Arial"/>
     </w:rPr>
   </w:style>
-  <w:style w:type="paragraph" w:styleId="Nadpis1">
+  <w:style w:type="paragraph" w:styleId="Heading1">
     <w:name w:val="heading 1"/>
     <w:basedOn w:val="Nadpiskapitoly"/>
     <w:next w:val="Textnormy"/>
-    <w:link w:val="Nadpis1Char"/>
+    <w:link w:val="Heading1Char"/>
     <w:uiPriority w:val="99"/>
     <w:qFormat/>
     <w:rsid w:val="00AB0F94"/>
@@ -4375,101 +4185,101 @@
       <w:color w:val="003366"/>
     </w:rPr>
   </w:style>
-  <w:style w:type="paragraph" w:styleId="Nadpis2">
+  <w:style w:type="paragraph" w:styleId="Heading2">
     <w:name w:val="heading 2"/>
     <w:basedOn w:val="Nadpislnku"/>
     <w:next w:val="Textnormy"/>
-    <w:link w:val="Nadpis2Char"/>
+    <w:link w:val="Heading2Char"/>
     <w:qFormat/>
     <w:rsid w:val="000F1D67"/>
     <w:pPr>
       <w:outlineLvl w:val="1"/>
     </w:pPr>
   </w:style>
-  <w:style w:type="paragraph" w:styleId="Nadpis3">
+  <w:style w:type="paragraph" w:styleId="Heading3">
     <w:name w:val="heading 3"/>
     <w:basedOn w:val="Nadpislnku"/>
     <w:next w:val="Textnormy"/>
-    <w:link w:val="Nadpis3Char"/>
+    <w:link w:val="Heading3Char"/>
     <w:qFormat/>
     <w:rsid w:val="000F1D67"/>
     <w:pPr>
       <w:outlineLvl w:val="2"/>
     </w:pPr>
   </w:style>
-  <w:style w:type="paragraph" w:styleId="Nadpis4">
+  <w:style w:type="paragraph" w:styleId="Heading4">
     <w:name w:val="heading 4"/>
     <w:basedOn w:val="Nadpislnku"/>
     <w:next w:val="Textnormy"/>
-    <w:link w:val="Nadpis4Char"/>
+    <w:link w:val="Heading4Char"/>
     <w:qFormat/>
     <w:rsid w:val="000F1D67"/>
     <w:pPr>
       <w:outlineLvl w:val="3"/>
     </w:pPr>
   </w:style>
-  <w:style w:type="paragraph" w:styleId="Nadpis5">
+  <w:style w:type="paragraph" w:styleId="Heading5">
     <w:name w:val="heading 5"/>
     <w:basedOn w:val="Nadpislnku"/>
     <w:next w:val="Textnormy"/>
-    <w:link w:val="Nadpis5Char"/>
+    <w:link w:val="Heading5Char"/>
     <w:qFormat/>
     <w:rsid w:val="000F1D67"/>
     <w:pPr>
       <w:outlineLvl w:val="4"/>
     </w:pPr>
   </w:style>
-  <w:style w:type="paragraph" w:styleId="Nadpis6">
+  <w:style w:type="paragraph" w:styleId="Heading6">
     <w:name w:val="heading 6"/>
     <w:basedOn w:val="Nadpislnku"/>
     <w:next w:val="Textnormy"/>
-    <w:link w:val="Nadpis6Char"/>
+    <w:link w:val="Heading6Char"/>
     <w:qFormat/>
     <w:rsid w:val="000F1D67"/>
     <w:pPr>
       <w:outlineLvl w:val="5"/>
     </w:pPr>
   </w:style>
-  <w:style w:type="paragraph" w:styleId="Nadpis7">
+  <w:style w:type="paragraph" w:styleId="Heading7">
     <w:name w:val="heading 7"/>
     <w:basedOn w:val="Nadpislnku"/>
     <w:next w:val="Textnormy"/>
-    <w:link w:val="Nadpis7Char"/>
+    <w:link w:val="Heading7Char"/>
     <w:qFormat/>
     <w:rsid w:val="000F1D67"/>
     <w:pPr>
       <w:outlineLvl w:val="6"/>
     </w:pPr>
   </w:style>
-  <w:style w:type="paragraph" w:styleId="Nadpis8">
+  <w:style w:type="paragraph" w:styleId="Heading8">
     <w:name w:val="heading 8"/>
     <w:basedOn w:val="Nadpislnku"/>
     <w:next w:val="Textnormy"/>
-    <w:link w:val="Nadpis8Char"/>
+    <w:link w:val="Heading8Char"/>
     <w:qFormat/>
     <w:rsid w:val="000F1D67"/>
     <w:pPr>
       <w:outlineLvl w:val="7"/>
     </w:pPr>
   </w:style>
-  <w:style w:type="paragraph" w:styleId="Nadpis9">
+  <w:style w:type="paragraph" w:styleId="Heading9">
     <w:name w:val="heading 9"/>
     <w:basedOn w:val="Nadpislnku"/>
     <w:next w:val="Textnormy"/>
-    <w:link w:val="Nadpis9Char"/>
+    <w:link w:val="Heading9Char"/>
     <w:qFormat/>
     <w:rsid w:val="000F1D67"/>
     <w:pPr>
       <w:outlineLvl w:val="8"/>
     </w:pPr>
   </w:style>
-  <w:style w:type="character" w:default="1" w:styleId="Standardnpsmoodstavce">
+  <w:style w:type="character" w:default="1" w:styleId="DefaultParagraphFont">
     <w:name w:val="Default Paragraph Font"/>
     <w:uiPriority w:val="1"/>
     <w:semiHidden/>
     <w:unhideWhenUsed/>
   </w:style>
-  <w:style w:type="table" w:default="1" w:styleId="Normlntabulka">
+  <w:style w:type="table" w:default="1" w:styleId="TableNormal">
     <w:name w:val="Normal Table"/>
     <w:uiPriority w:val="99"/>
     <w:semiHidden/>
@@ -4484,13 +4294,13 @@
       </w:tblCellMar>
     </w:tblPr>
   </w:style>
-  <w:style w:type="numbering" w:default="1" w:styleId="Bezseznamu">
+  <w:style w:type="numbering" w:default="1" w:styleId="NoList">
     <w:name w:val="No List"/>
     <w:uiPriority w:val="99"/>
     <w:semiHidden/>
     <w:unhideWhenUsed/>
   </w:style>
-  <w:style w:type="character" w:styleId="slostrnky">
+  <w:style w:type="character" w:styleId="PageNumber">
     <w:name w:val="page number"/>
     <w:qFormat/>
     <w:rsid w:val="000F1D67"/>
@@ -4522,14 +4332,14 @@
       <w:u w:val="single"/>
     </w:rPr>
   </w:style>
-  <w:style w:type="character" w:styleId="AkronymHTML">
+  <w:style w:type="character" w:styleId="HTMLAcronym">
     <w:name w:val="HTML Acronym"/>
-    <w:basedOn w:val="Standardnpsmoodstavce"/>
+    <w:basedOn w:val="DefaultParagraphFont"/>
     <w:semiHidden/>
     <w:qFormat/>
     <w:rsid w:val="000F1D67"/>
   </w:style>
-  <w:style w:type="character" w:styleId="CittHTML">
+  <w:style w:type="character" w:styleId="HTMLCite">
     <w:name w:val="HTML Cite"/>
     <w:semiHidden/>
     <w:qFormat/>
@@ -4539,14 +4349,14 @@
       <w:iCs/>
     </w:rPr>
   </w:style>
-  <w:style w:type="character" w:styleId="slodku">
+  <w:style w:type="character" w:styleId="LineNumber">
     <w:name w:val="line number"/>
-    <w:basedOn w:val="Standardnpsmoodstavce"/>
+    <w:basedOn w:val="DefaultParagraphFont"/>
     <w:semiHidden/>
     <w:qFormat/>
     <w:rsid w:val="000F1D67"/>
   </w:style>
-  <w:style w:type="character" w:styleId="DefiniceHTML">
+  <w:style w:type="character" w:styleId="HTMLDefinition">
     <w:name w:val="HTML Definition"/>
     <w:semiHidden/>
     <w:qFormat/>
@@ -4556,7 +4366,7 @@
       <w:iCs/>
     </w:rPr>
   </w:style>
-  <w:style w:type="character" w:styleId="KlvesniceHTML">
+  <w:style w:type="character" w:styleId="HTMLKeyboard">
     <w:name w:val="HTML Keyboard"/>
     <w:semiHidden/>
     <w:qFormat/>
@@ -4567,7 +4377,7 @@
       <w:szCs w:val="20"/>
     </w:rPr>
   </w:style>
-  <w:style w:type="character" w:styleId="KdHTML">
+  <w:style w:type="character" w:styleId="HTMLCode">
     <w:name w:val="HTML Code"/>
     <w:semiHidden/>
     <w:qFormat/>
@@ -4578,7 +4388,7 @@
       <w:szCs w:val="20"/>
     </w:rPr>
   </w:style>
-  <w:style w:type="character" w:styleId="PromnnHTML">
+  <w:style w:type="character" w:styleId="HTMLVariable">
     <w:name w:val="HTML Variable"/>
     <w:semiHidden/>
     <w:qFormat/>
@@ -4588,7 +4398,7 @@
       <w:iCs/>
     </w:rPr>
   </w:style>
-  <w:style w:type="character" w:styleId="PsacstrojHTML">
+  <w:style w:type="character" w:styleId="HTMLTypewriter">
     <w:name w:val="HTML Typewriter"/>
     <w:semiHidden/>
     <w:qFormat/>
@@ -4599,7 +4409,7 @@
       <w:szCs w:val="20"/>
     </w:rPr>
   </w:style>
-  <w:style w:type="character" w:styleId="Siln">
+  <w:style w:type="character" w:styleId="Strong">
     <w:name w:val="Strong"/>
     <w:uiPriority w:val="22"/>
     <w:qFormat/>
@@ -4618,7 +4428,7 @@
       <w:u w:val="single"/>
     </w:rPr>
   </w:style>
-  <w:style w:type="character" w:styleId="UkzkaHTML">
+  <w:style w:type="character" w:styleId="HTMLSample">
     <w:name w:val="HTML Sample"/>
     <w:semiHidden/>
     <w:qFormat/>
@@ -4627,7 +4437,7 @@
       <w:rFonts w:ascii="Courier New" w:hAnsi="Courier New" w:cs="Courier New"/>
     </w:rPr>
   </w:style>
-  <w:style w:type="character" w:styleId="Zdraznn">
+  <w:style w:type="character" w:styleId="Emphasis">
     <w:name w:val="Emphasis"/>
     <w:uiPriority w:val="20"/>
     <w:qFormat/>
@@ -4656,10 +4466,10 @@
       <w:b/>
     </w:rPr>
   </w:style>
-  <w:style w:type="character" w:customStyle="1" w:styleId="Nadpis2Char">
-    <w:name w:val="Nadpis 2 Char"/>
+  <w:style w:type="character" w:customStyle="1" w:styleId="Heading2Char">
+    <w:name w:val="Heading 2 Char"/>
     <w:basedOn w:val="NadpislnkuChar"/>
-    <w:link w:val="Nadpis2"/>
+    <w:link w:val="Heading2"/>
     <w:qFormat/>
     <w:rsid w:val="000F1D67"/>
     <w:rPr>
@@ -4677,7 +4487,7 @@
       <w:rFonts w:ascii="Arial" w:hAnsi="Arial"/>
     </w:rPr>
   </w:style>
-  <w:style w:type="character" w:styleId="Odkaznakoment">
+  <w:style w:type="character" w:styleId="CommentReference">
     <w:name w:val="annotation reference"/>
     <w:qFormat/>
     <w:rsid w:val="000F1D67"/>
@@ -4686,18 +4496,18 @@
       <w:szCs w:val="16"/>
     </w:rPr>
   </w:style>
-  <w:style w:type="character" w:customStyle="1" w:styleId="TextkomenteChar">
-    <w:name w:val="Text komentáře Char"/>
-    <w:link w:val="Textkomente"/>
+  <w:style w:type="character" w:customStyle="1" w:styleId="CommentTextChar">
+    <w:name w:val="Comment Text Char"/>
+    <w:link w:val="CommentText"/>
     <w:qFormat/>
     <w:rsid w:val="000F1D67"/>
     <w:rPr>
       <w:rFonts w:ascii="Arial" w:hAnsi="Arial"/>
     </w:rPr>
   </w:style>
-  <w:style w:type="character" w:customStyle="1" w:styleId="PedmtkomenteChar">
-    <w:name w:val="Předmět komentáře Char"/>
-    <w:link w:val="Pedmtkomente"/>
+  <w:style w:type="character" w:customStyle="1" w:styleId="CommentSubjectChar">
+    <w:name w:val="Comment Subject Char"/>
+    <w:link w:val="CommentSubject"/>
     <w:qFormat/>
     <w:rsid w:val="000F1D67"/>
     <w:rPr>
@@ -4706,9 +4516,9 @@
       <w:bCs/>
     </w:rPr>
   </w:style>
-  <w:style w:type="character" w:customStyle="1" w:styleId="TextbublinyChar">
-    <w:name w:val="Text bubliny Char"/>
-    <w:link w:val="Textbubliny"/>
+  <w:style w:type="character" w:customStyle="1" w:styleId="BalloonTextChar">
+    <w:name w:val="Balloon Text Char"/>
+    <w:link w:val="BalloonText"/>
     <w:qFormat/>
     <w:rsid w:val="000F1D67"/>
     <w:rPr>
@@ -4738,9 +4548,9 @@
       <w:sz w:val="28"/>
     </w:rPr>
   </w:style>
-  <w:style w:type="character" w:customStyle="1" w:styleId="Nadpis1Char">
-    <w:name w:val="Nadpis 1 Char"/>
-    <w:link w:val="Nadpis1"/>
+  <w:style w:type="character" w:customStyle="1" w:styleId="Heading1Char">
+    <w:name w:val="Heading 1 Char"/>
+    <w:link w:val="Heading1"/>
     <w:uiPriority w:val="99"/>
     <w:qFormat/>
     <w:rsid w:val="00AB0F94"/>
@@ -4751,9 +4561,9 @@
       <w:sz w:val="22"/>
     </w:rPr>
   </w:style>
-  <w:style w:type="character" w:customStyle="1" w:styleId="Nadpis3Char">
-    <w:name w:val="Nadpis 3 Char"/>
-    <w:link w:val="Nadpis3"/>
+  <w:style w:type="character" w:customStyle="1" w:styleId="Heading3Char">
+    <w:name w:val="Heading 3 Char"/>
+    <w:link w:val="Heading3"/>
     <w:qFormat/>
     <w:rsid w:val="000F1D67"/>
     <w:rPr>
@@ -4761,9 +4571,9 @@
       <w:b/>
     </w:rPr>
   </w:style>
-  <w:style w:type="character" w:customStyle="1" w:styleId="Nadpis4Char">
-    <w:name w:val="Nadpis 4 Char"/>
-    <w:link w:val="Nadpis4"/>
+  <w:style w:type="character" w:customStyle="1" w:styleId="Heading4Char">
+    <w:name w:val="Heading 4 Char"/>
+    <w:link w:val="Heading4"/>
     <w:qFormat/>
     <w:rsid w:val="000F1D67"/>
     <w:rPr>
@@ -4771,9 +4581,9 @@
       <w:b/>
     </w:rPr>
   </w:style>
-  <w:style w:type="character" w:customStyle="1" w:styleId="Nadpis5Char">
-    <w:name w:val="Nadpis 5 Char"/>
-    <w:link w:val="Nadpis5"/>
+  <w:style w:type="character" w:customStyle="1" w:styleId="Heading5Char">
+    <w:name w:val="Heading 5 Char"/>
+    <w:link w:val="Heading5"/>
     <w:qFormat/>
     <w:rsid w:val="000F1D67"/>
     <w:rPr>
@@ -4781,9 +4591,9 @@
       <w:b/>
     </w:rPr>
   </w:style>
-  <w:style w:type="character" w:customStyle="1" w:styleId="Nadpis6Char">
-    <w:name w:val="Nadpis 6 Char"/>
-    <w:link w:val="Nadpis6"/>
+  <w:style w:type="character" w:customStyle="1" w:styleId="Heading6Char">
+    <w:name w:val="Heading 6 Char"/>
+    <w:link w:val="Heading6"/>
     <w:qFormat/>
     <w:rsid w:val="000F1D67"/>
     <w:rPr>
@@ -4791,9 +4601,9 @@
       <w:b/>
     </w:rPr>
   </w:style>
-  <w:style w:type="character" w:customStyle="1" w:styleId="Nadpis7Char">
-    <w:name w:val="Nadpis 7 Char"/>
-    <w:link w:val="Nadpis7"/>
+  <w:style w:type="character" w:customStyle="1" w:styleId="Heading7Char">
+    <w:name w:val="Heading 7 Char"/>
+    <w:link w:val="Heading7"/>
     <w:qFormat/>
     <w:rsid w:val="000F1D67"/>
     <w:rPr>
@@ -4801,9 +4611,9 @@
       <w:b/>
     </w:rPr>
   </w:style>
-  <w:style w:type="character" w:customStyle="1" w:styleId="Nadpis8Char">
-    <w:name w:val="Nadpis 8 Char"/>
-    <w:link w:val="Nadpis8"/>
+  <w:style w:type="character" w:customStyle="1" w:styleId="Heading8Char">
+    <w:name w:val="Heading 8 Char"/>
+    <w:link w:val="Heading8"/>
     <w:qFormat/>
     <w:rsid w:val="000F1D67"/>
     <w:rPr>
@@ -4811,9 +4621,9 @@
       <w:b/>
     </w:rPr>
   </w:style>
-  <w:style w:type="character" w:customStyle="1" w:styleId="Nadpis9Char">
-    <w:name w:val="Nadpis 9 Char"/>
-    <w:link w:val="Nadpis9"/>
+  <w:style w:type="character" w:customStyle="1" w:styleId="Heading9Char">
+    <w:name w:val="Heading 9 Char"/>
+    <w:link w:val="Heading9"/>
     <w:qFormat/>
     <w:rsid w:val="000F1D67"/>
     <w:rPr>
@@ -4832,9 +4642,9 @@
       <w:i/>
     </w:rPr>
   </w:style>
-  <w:style w:type="character" w:customStyle="1" w:styleId="ZhlavChar">
-    <w:name w:val="Záhlaví Char"/>
-    <w:link w:val="Zhlav"/>
+  <w:style w:type="character" w:customStyle="1" w:styleId="HeaderChar">
+    <w:name w:val="Header Char"/>
+    <w:link w:val="Header"/>
     <w:qFormat/>
     <w:rsid w:val="000F1D67"/>
     <w:rPr>
@@ -4842,9 +4652,9 @@
       <w:sz w:val="18"/>
     </w:rPr>
   </w:style>
-  <w:style w:type="character" w:customStyle="1" w:styleId="ZpatChar">
-    <w:name w:val="Zápatí Char"/>
-    <w:link w:val="Zpat"/>
+  <w:style w:type="character" w:customStyle="1" w:styleId="FooterChar">
+    <w:name w:val="Footer Char"/>
+    <w:link w:val="Footer"/>
     <w:qFormat/>
     <w:rsid w:val="000F1D67"/>
     <w:rPr>
@@ -4852,18 +4662,18 @@
       <w:sz w:val="18"/>
     </w:rPr>
   </w:style>
-  <w:style w:type="character" w:customStyle="1" w:styleId="ZkladntextChar">
-    <w:name w:val="Základní text Char"/>
-    <w:link w:val="Zkladntext"/>
+  <w:style w:type="character" w:customStyle="1" w:styleId="BodyTextChar">
+    <w:name w:val="Body Text Char"/>
+    <w:link w:val="BodyText"/>
     <w:qFormat/>
     <w:rsid w:val="000F1D67"/>
     <w:rPr>
       <w:rFonts w:ascii="Arial" w:hAnsi="Arial"/>
     </w:rPr>
   </w:style>
-  <w:style w:type="character" w:customStyle="1" w:styleId="TextpoznpodarouChar">
-    <w:name w:val="Text pozn. pod čarou Char"/>
-    <w:link w:val="Textpoznpodarou"/>
+  <w:style w:type="character" w:customStyle="1" w:styleId="FootnoteTextChar">
+    <w:name w:val="Footnote Text Char"/>
+    <w:link w:val="FootnoteText"/>
     <w:qFormat/>
     <w:rsid w:val="000F1D67"/>
     <w:rPr>
@@ -4881,9 +4691,9 @@
       <w:lang w:eastAsia="cs-CZ" w:bidi="ar-SA"/>
     </w:rPr>
   </w:style>
-  <w:style w:type="character" w:customStyle="1" w:styleId="NzevChar">
-    <w:name w:val="Název Char"/>
-    <w:link w:val="Nzev"/>
+  <w:style w:type="character" w:customStyle="1" w:styleId="TitleChar">
+    <w:name w:val="Title Char"/>
+    <w:link w:val="Title"/>
     <w:qFormat/>
     <w:rsid w:val="000F1D67"/>
     <w:rPr>
@@ -4912,8 +4722,8 @@
   </w:style>
   <w:style w:type="paragraph" w:customStyle="1" w:styleId="Nadpis">
     <w:name w:val="Nadpis"/>
-    <w:basedOn w:val="Normln"/>
-    <w:next w:val="Zkladntext"/>
+    <w:basedOn w:val="Normal"/>
+    <w:next w:val="BodyText"/>
     <w:qFormat/>
     <w:rsid w:val="000F1D67"/>
     <w:rPr>
@@ -4922,28 +4732,28 @@
       <w:sz w:val="28"/>
     </w:rPr>
   </w:style>
-  <w:style w:type="paragraph" w:styleId="Zkladntext">
+  <w:style w:type="paragraph" w:styleId="BodyText">
     <w:name w:val="Body Text"/>
-    <w:basedOn w:val="Normln"/>
-    <w:link w:val="ZkladntextChar"/>
+    <w:basedOn w:val="Normal"/>
+    <w:link w:val="BodyTextChar"/>
     <w:rsid w:val="000F1D67"/>
     <w:pPr>
       <w:spacing w:after="120"/>
     </w:pPr>
   </w:style>
-  <w:style w:type="paragraph" w:styleId="Seznam">
+  <w:style w:type="paragraph" w:styleId="List">
     <w:name w:val="List"/>
-    <w:basedOn w:val="Normln"/>
+    <w:basedOn w:val="Normal"/>
     <w:semiHidden/>
     <w:rsid w:val="000F1D67"/>
     <w:pPr>
       <w:ind w:left="283" w:hanging="283"/>
     </w:pPr>
   </w:style>
-  <w:style w:type="paragraph" w:styleId="Titulek">
+  <w:style w:type="paragraph" w:styleId="Caption">
     <w:name w:val="caption"/>
-    <w:basedOn w:val="Normln"/>
-    <w:next w:val="Normln"/>
+    <w:basedOn w:val="Normal"/>
+    <w:next w:val="Normal"/>
     <w:qFormat/>
     <w:rsid w:val="001A318B"/>
     <w:pPr>
@@ -4957,7 +4767,7 @@
   </w:style>
   <w:style w:type="paragraph" w:customStyle="1" w:styleId="Rejstk">
     <w:name w:val="Rejstřík"/>
-    <w:basedOn w:val="Normln"/>
+    <w:basedOn w:val="Normal"/>
     <w:qFormat/>
     <w:pPr>
       <w:suppressLineNumbers/>
@@ -4968,7 +4778,7 @@
   </w:style>
   <w:style w:type="paragraph" w:customStyle="1" w:styleId="Nadpiskapitoly">
     <w:name w:val="Nadpis kapitoly"/>
-    <w:basedOn w:val="Normln"/>
+    <w:basedOn w:val="Normal"/>
     <w:next w:val="Textnormy"/>
     <w:qFormat/>
     <w:rsid w:val="000F1D67"/>
@@ -5066,9 +4876,9 @@
       <w:sz w:val="18"/>
     </w:rPr>
   </w:style>
-  <w:style w:type="paragraph" w:styleId="slovanseznam">
+  <w:style w:type="paragraph" w:styleId="ListNumber">
     <w:name w:val="List Number"/>
-    <w:basedOn w:val="Normln"/>
+    <w:basedOn w:val="Normal"/>
     <w:semiHidden/>
     <w:qFormat/>
     <w:rsid w:val="000F1D67"/>
@@ -5076,7 +4886,7 @@
       <w:ind w:left="1415" w:hanging="283"/>
     </w:pPr>
   </w:style>
-  <w:style w:type="paragraph" w:styleId="Rejstk1">
+  <w:style w:type="paragraph" w:styleId="Index1">
     <w:name w:val="index 1"/>
     <w:basedOn w:val="Textnormy"/>
     <w:next w:val="Textnormy"/>
@@ -5139,22 +4949,22 @@
   </w:style>
   <w:style w:type="paragraph" w:customStyle="1" w:styleId="Zhlavazpat">
     <w:name w:val="Záhlaví a zápatí"/>
-    <w:basedOn w:val="Normln"/>
-    <w:qFormat/>
-  </w:style>
-  <w:style w:type="paragraph" w:styleId="Zhlav">
+    <w:basedOn w:val="Normal"/>
+    <w:qFormat/>
+  </w:style>
+  <w:style w:type="paragraph" w:styleId="Header">
     <w:name w:val="header"/>
     <w:basedOn w:val="Textnormy"/>
-    <w:link w:val="ZhlavChar"/>
+    <w:link w:val="HeaderChar"/>
     <w:rsid w:val="000F1D67"/>
     <w:rPr>
       <w:sz w:val="18"/>
     </w:rPr>
   </w:style>
-  <w:style w:type="paragraph" w:styleId="Zpat">
+  <w:style w:type="paragraph" w:styleId="Footer">
     <w:name w:val="footer"/>
     <w:basedOn w:val="Textnormy"/>
-    <w:link w:val="ZpatChar"/>
+    <w:link w:val="FooterChar"/>
     <w:rsid w:val="000F1D67"/>
     <w:pPr>
       <w:jc w:val="center"/>
@@ -5163,14 +4973,14 @@
       <w:sz w:val="18"/>
     </w:rPr>
   </w:style>
-  <w:style w:type="paragraph" w:styleId="Obsah2">
+  <w:style w:type="paragraph" w:styleId="TOC2">
     <w:name w:val="toc 2"/>
-    <w:basedOn w:val="Obsah1"/>
+    <w:basedOn w:val="TOC1"/>
     <w:next w:val="Textnormy"/>
     <w:uiPriority w:val="39"/>
     <w:rsid w:val="000F1D67"/>
   </w:style>
-  <w:style w:type="paragraph" w:styleId="Obsah1">
+  <w:style w:type="paragraph" w:styleId="TOC1">
     <w:name w:val="toc 1"/>
     <w:basedOn w:val="Textnormy"/>
     <w:next w:val="Textnormy"/>
@@ -5188,49 +4998,49 @@
       <w:sz w:val="18"/>
     </w:rPr>
   </w:style>
-  <w:style w:type="paragraph" w:styleId="Obsah5">
+  <w:style w:type="paragraph" w:styleId="TOC5">
     <w:name w:val="toc 5"/>
-    <w:basedOn w:val="Obsah1"/>
+    <w:basedOn w:val="TOC1"/>
     <w:next w:val="Textnormy"/>
     <w:semiHidden/>
     <w:rsid w:val="000F1D67"/>
   </w:style>
-  <w:style w:type="paragraph" w:styleId="Obsah3">
+  <w:style w:type="paragraph" w:styleId="TOC3">
     <w:name w:val="toc 3"/>
-    <w:basedOn w:val="Obsah1"/>
+    <w:basedOn w:val="TOC1"/>
     <w:next w:val="Textnormy"/>
     <w:rsid w:val="000F1D67"/>
   </w:style>
-  <w:style w:type="paragraph" w:styleId="Obsah4">
+  <w:style w:type="paragraph" w:styleId="TOC4">
     <w:name w:val="toc 4"/>
-    <w:basedOn w:val="Obsah1"/>
+    <w:basedOn w:val="TOC1"/>
     <w:next w:val="Textnormy"/>
     <w:rsid w:val="000F1D67"/>
   </w:style>
-  <w:style w:type="paragraph" w:styleId="Obsah6">
+  <w:style w:type="paragraph" w:styleId="TOC6">
     <w:name w:val="toc 6"/>
-    <w:basedOn w:val="Obsah1"/>
+    <w:basedOn w:val="TOC1"/>
     <w:next w:val="Textnormy"/>
     <w:rsid w:val="000F1D67"/>
   </w:style>
-  <w:style w:type="paragraph" w:styleId="Obsah7">
+  <w:style w:type="paragraph" w:styleId="TOC7">
     <w:name w:val="toc 7"/>
-    <w:basedOn w:val="Obsah1"/>
+    <w:basedOn w:val="TOC1"/>
     <w:next w:val="Textnormy"/>
     <w:semiHidden/>
     <w:rsid w:val="000F1D67"/>
   </w:style>
-  <w:style w:type="paragraph" w:styleId="Obsah8">
+  <w:style w:type="paragraph" w:styleId="TOC8">
     <w:name w:val="toc 8"/>
-    <w:basedOn w:val="Obsah1"/>
+    <w:basedOn w:val="TOC1"/>
     <w:next w:val="Textnormy"/>
     <w:semiHidden/>
     <w:rsid w:val="000F1D67"/>
   </w:style>
-  <w:style w:type="paragraph" w:styleId="Obsah9">
+  <w:style w:type="paragraph" w:styleId="TOC9">
     <w:name w:val="toc 9"/>
-    <w:basedOn w:val="Normln"/>
-    <w:next w:val="Normln"/>
+    <w:basedOn w:val="Normal"/>
+    <w:next w:val="Normal"/>
     <w:autoRedefine/>
     <w:semiHidden/>
     <w:rsid w:val="000F1D67"/>
@@ -5282,10 +5092,10 @@
       <w:jc w:val="center"/>
     </w:pPr>
   </w:style>
-  <w:style w:type="paragraph" w:styleId="Textpoznpodarou">
+  <w:style w:type="paragraph" w:styleId="FootnoteText">
     <w:name w:val="footnote text"/>
     <w:basedOn w:val="Poznmka"/>
-    <w:link w:val="TextpoznpodarouChar"/>
+    <w:link w:val="FootnoteTextChar"/>
     <w:rsid w:val="000F1D67"/>
     <w:pPr>
       <w:spacing w:before="60" w:after="0"/>
@@ -5333,16 +5143,16 @@
       <w:sz w:val="28"/>
     </w:rPr>
   </w:style>
-  <w:style w:type="paragraph" w:styleId="Zptenadresanaoblku">
+  <w:style w:type="paragraph" w:styleId="EnvelopeReturn">
     <w:name w:val="envelope return"/>
-    <w:basedOn w:val="Normln"/>
-    <w:qFormat/>
-    <w:rsid w:val="000F1D67"/>
-  </w:style>
-  <w:style w:type="paragraph" w:styleId="Hlavikarejstku">
+    <w:basedOn w:val="Normal"/>
+    <w:qFormat/>
+    <w:rsid w:val="000F1D67"/>
+  </w:style>
+  <w:style w:type="paragraph" w:styleId="IndexHeading">
     <w:name w:val="index heading"/>
     <w:basedOn w:val="Textnormy"/>
-    <w:next w:val="Rejstk1"/>
+    <w:next w:val="Index1"/>
     <w:qFormat/>
     <w:rsid w:val="000F1D67"/>
     <w:pPr>
@@ -5541,7 +5351,7 @@
   </w:style>
   <w:style w:type="paragraph" w:customStyle="1" w:styleId="Tir">
     <w:name w:val="Tiráž"/>
-    <w:basedOn w:val="Normln"/>
+    <w:basedOn w:val="Normal"/>
     <w:qFormat/>
     <w:rsid w:val="000F1D67"/>
     <w:rPr>
@@ -5550,7 +5360,7 @@
   </w:style>
   <w:style w:type="paragraph" w:customStyle="1" w:styleId="1StrCopyright">
     <w:name w:val="1StrCopyright"/>
-    <w:basedOn w:val="Zpat"/>
+    <w:basedOn w:val="Footer"/>
     <w:qFormat/>
     <w:rsid w:val="000F1D67"/>
     <w:pPr>
@@ -5589,16 +5399,16 @@
   </w:style>
   <w:style w:type="paragraph" w:customStyle="1" w:styleId="Upozornn">
     <w:name w:val="Upozornění"/>
-    <w:basedOn w:val="Normln"/>
+    <w:basedOn w:val="Normal"/>
     <w:qFormat/>
     <w:rsid w:val="000F1D67"/>
     <w:rPr>
       <w:sz w:val="18"/>
     </w:rPr>
   </w:style>
-  <w:style w:type="paragraph" w:styleId="AdresaHTML">
+  <w:style w:type="paragraph" w:styleId="HTMLAddress">
     <w:name w:val="HTML Address"/>
-    <w:basedOn w:val="Normln"/>
+    <w:basedOn w:val="Normal"/>
     <w:semiHidden/>
     <w:qFormat/>
     <w:rsid w:val="000F1D67"/>
@@ -5607,9 +5417,9 @@
       <w:iCs/>
     </w:rPr>
   </w:style>
-  <w:style w:type="paragraph" w:styleId="Adresanaoblku">
+  <w:style w:type="paragraph" w:styleId="EnvelopeAddress">
     <w:name w:val="envelope address"/>
-    <w:basedOn w:val="Normln"/>
+    <w:basedOn w:val="Normal"/>
     <w:semiHidden/>
     <w:qFormat/>
     <w:rsid w:val="000F1D67"/>
@@ -5622,42 +5432,42 @@
       <w:szCs w:val="24"/>
     </w:rPr>
   </w:style>
-  <w:style w:type="paragraph" w:styleId="slovanseznam2">
+  <w:style w:type="paragraph" w:styleId="ListNumber2">
     <w:name w:val="List Number 2"/>
-    <w:basedOn w:val="Normln"/>
-    <w:qFormat/>
-    <w:rsid w:val="000F1D67"/>
-  </w:style>
-  <w:style w:type="paragraph" w:styleId="slovanseznam3">
+    <w:basedOn w:val="Normal"/>
+    <w:qFormat/>
+    <w:rsid w:val="000F1D67"/>
+  </w:style>
+  <w:style w:type="paragraph" w:styleId="ListNumber3">
     <w:name w:val="List Number 3"/>
-    <w:basedOn w:val="Normln"/>
-    <w:qFormat/>
-    <w:rsid w:val="000F1D67"/>
-  </w:style>
-  <w:style w:type="paragraph" w:styleId="slovanseznam4">
+    <w:basedOn w:val="Normal"/>
+    <w:qFormat/>
+    <w:rsid w:val="000F1D67"/>
+  </w:style>
+  <w:style w:type="paragraph" w:styleId="ListNumber4">
     <w:name w:val="List Number 4"/>
-    <w:basedOn w:val="Normln"/>
-    <w:qFormat/>
-    <w:rsid w:val="000F1D67"/>
-  </w:style>
-  <w:style w:type="paragraph" w:styleId="slovanseznam5">
+    <w:basedOn w:val="Normal"/>
+    <w:qFormat/>
+    <w:rsid w:val="000F1D67"/>
+  </w:style>
+  <w:style w:type="paragraph" w:styleId="ListNumber5">
     <w:name w:val="List Number 5"/>
-    <w:basedOn w:val="Normln"/>
+    <w:basedOn w:val="Normal"/>
     <w:semiHidden/>
     <w:qFormat/>
     <w:rsid w:val="000F1D67"/>
   </w:style>
-  <w:style w:type="paragraph" w:styleId="Datum">
+  <w:style w:type="paragraph" w:styleId="Date">
     <w:name w:val="Date"/>
-    <w:basedOn w:val="Normln"/>
-    <w:next w:val="Normln"/>
+    <w:basedOn w:val="Normal"/>
+    <w:next w:val="Normal"/>
     <w:semiHidden/>
     <w:qFormat/>
     <w:rsid w:val="000F1D67"/>
   </w:style>
-  <w:style w:type="paragraph" w:styleId="FormtovanvHTML">
+  <w:style w:type="paragraph" w:styleId="HTMLPreformatted">
     <w:name w:val="HTML Preformatted"/>
-    <w:basedOn w:val="Normln"/>
+    <w:basedOn w:val="Normal"/>
     <w:semiHidden/>
     <w:qFormat/>
     <w:rsid w:val="000F1D67"/>
@@ -5665,18 +5475,18 @@
       <w:rFonts w:ascii="Courier New" w:hAnsi="Courier New" w:cs="Courier New"/>
     </w:rPr>
   </w:style>
-  <w:style w:type="paragraph" w:styleId="Nadpispoznmky">
+  <w:style w:type="paragraph" w:styleId="NoteHeading">
     <w:name w:val="Note Heading"/>
-    <w:basedOn w:val="Normln"/>
-    <w:next w:val="Normln"/>
+    <w:basedOn w:val="Normal"/>
+    <w:next w:val="Normal"/>
     <w:semiHidden/>
     <w:qFormat/>
     <w:rsid w:val="000F1D67"/>
   </w:style>
-  <w:style w:type="paragraph" w:styleId="Nzev">
+  <w:style w:type="paragraph" w:styleId="Title">
     <w:name w:val="Title"/>
-    <w:basedOn w:val="Normln"/>
-    <w:link w:val="NzevChar"/>
+    <w:basedOn w:val="Normal"/>
+    <w:link w:val="TitleChar"/>
     <w:qFormat/>
     <w:rsid w:val="000F1D67"/>
     <w:pPr>
@@ -5692,9 +5502,9 @@
       <w:szCs w:val="40"/>
     </w:rPr>
   </w:style>
-  <w:style w:type="paragraph" w:styleId="Normlnweb">
+  <w:style w:type="paragraph" w:styleId="NormalWeb">
     <w:name w:val="Normal (Web)"/>
-    <w:basedOn w:val="Normln"/>
+    <w:basedOn w:val="Normal"/>
     <w:uiPriority w:val="99"/>
     <w:semiHidden/>
     <w:qFormat/>
@@ -5705,9 +5515,9 @@
       <w:szCs w:val="24"/>
     </w:rPr>
   </w:style>
-  <w:style w:type="paragraph" w:styleId="Normlnodsazen">
+  <w:style w:type="paragraph" w:styleId="NormalIndent">
     <w:name w:val="Normal Indent"/>
-    <w:basedOn w:val="Normln"/>
+    <w:basedOn w:val="Normal"/>
     <w:semiHidden/>
     <w:qFormat/>
     <w:rsid w:val="000F1D67"/>
@@ -5715,32 +5525,32 @@
       <w:ind w:left="708"/>
     </w:pPr>
   </w:style>
-  <w:style w:type="paragraph" w:styleId="Osloven">
+  <w:style w:type="paragraph" w:styleId="Salutation">
     <w:name w:val="Salutation"/>
-    <w:basedOn w:val="Normln"/>
-    <w:next w:val="Normln"/>
+    <w:basedOn w:val="Normal"/>
+    <w:next w:val="Normal"/>
     <w:semiHidden/>
     <w:rsid w:val="000F1D67"/>
   </w:style>
-  <w:style w:type="paragraph" w:styleId="Podpis">
+  <w:style w:type="paragraph" w:styleId="Signature">
     <w:name w:val="Signature"/>
-    <w:basedOn w:val="Normln"/>
+    <w:basedOn w:val="Normal"/>
     <w:semiHidden/>
     <w:rsid w:val="000F1D67"/>
     <w:pPr>
       <w:ind w:left="4252"/>
     </w:pPr>
   </w:style>
-  <w:style w:type="paragraph" w:styleId="Podpise-mailu">
+  <w:style w:type="paragraph" w:styleId="EmailSignature">
     <w:name w:val="E-mail Signature"/>
-    <w:basedOn w:val="Normln"/>
+    <w:basedOn w:val="Normal"/>
     <w:semiHidden/>
     <w:qFormat/>
     <w:rsid w:val="000F1D67"/>
   </w:style>
-  <w:style w:type="paragraph" w:styleId="Podnadpis">
+  <w:style w:type="paragraph" w:styleId="Subtitle">
     <w:name w:val="Subtitle"/>
-    <w:basedOn w:val="Normln"/>
+    <w:basedOn w:val="Normal"/>
     <w:qFormat/>
     <w:rsid w:val="000F1D67"/>
     <w:pPr>
@@ -5754,9 +5564,9 @@
       <w:szCs w:val="24"/>
     </w:rPr>
   </w:style>
-  <w:style w:type="paragraph" w:styleId="Pokraovnseznamu">
+  <w:style w:type="paragraph" w:styleId="ListContinue">
     <w:name w:val="List Continue"/>
-    <w:basedOn w:val="Normln"/>
+    <w:basedOn w:val="Normal"/>
     <w:qFormat/>
     <w:rsid w:val="000F1D67"/>
     <w:pPr>
@@ -5764,9 +5574,9 @@
       <w:ind w:left="283"/>
     </w:pPr>
   </w:style>
-  <w:style w:type="paragraph" w:styleId="Pokraovnseznamu2">
+  <w:style w:type="paragraph" w:styleId="ListContinue2">
     <w:name w:val="List Continue 2"/>
-    <w:basedOn w:val="Normln"/>
+    <w:basedOn w:val="Normal"/>
     <w:qFormat/>
     <w:rsid w:val="000F1D67"/>
     <w:pPr>
@@ -5774,9 +5584,9 @@
       <w:ind w:left="566"/>
     </w:pPr>
   </w:style>
-  <w:style w:type="paragraph" w:styleId="Pokraovnseznamu3">
+  <w:style w:type="paragraph" w:styleId="ListContinue3">
     <w:name w:val="List Continue 3"/>
-    <w:basedOn w:val="Normln"/>
+    <w:basedOn w:val="Normal"/>
     <w:qFormat/>
     <w:rsid w:val="000F1D67"/>
     <w:pPr>
@@ -5784,9 +5594,9 @@
       <w:ind w:left="849"/>
     </w:pPr>
   </w:style>
-  <w:style w:type="paragraph" w:styleId="Pokraovnseznamu4">
+  <w:style w:type="paragraph" w:styleId="ListContinue4">
     <w:name w:val="List Continue 4"/>
-    <w:basedOn w:val="Normln"/>
+    <w:basedOn w:val="Normal"/>
     <w:qFormat/>
     <w:rsid w:val="000F1D67"/>
     <w:pPr>
@@ -5794,9 +5604,9 @@
       <w:ind w:left="1132"/>
     </w:pPr>
   </w:style>
-  <w:style w:type="paragraph" w:styleId="Pokraovnseznamu5">
+  <w:style w:type="paragraph" w:styleId="ListContinue5">
     <w:name w:val="List Continue 5"/>
-    <w:basedOn w:val="Normln"/>
+    <w:basedOn w:val="Normal"/>
     <w:semiHidden/>
     <w:qFormat/>
     <w:rsid w:val="000F1D67"/>
@@ -5805,9 +5615,9 @@
       <w:ind w:left="1415"/>
     </w:pPr>
   </w:style>
-  <w:style w:type="paragraph" w:styleId="Prosttext">
+  <w:style w:type="paragraph" w:styleId="PlainText">
     <w:name w:val="Plain Text"/>
-    <w:basedOn w:val="Normln"/>
+    <w:basedOn w:val="Normal"/>
     <w:semiHidden/>
     <w:qFormat/>
     <w:rsid w:val="000F1D67"/>
@@ -5815,16 +5625,16 @@
       <w:rFonts w:ascii="Courier New" w:hAnsi="Courier New" w:cs="Courier New"/>
     </w:rPr>
   </w:style>
-  <w:style w:type="paragraph" w:styleId="Seznamsodrkami3">
+  <w:style w:type="paragraph" w:styleId="ListBullet3">
     <w:name w:val="List Bullet 3"/>
-    <w:basedOn w:val="Normln"/>
+    <w:basedOn w:val="Normal"/>
     <w:semiHidden/>
     <w:qFormat/>
     <w:rsid w:val="000F1D67"/>
   </w:style>
-  <w:style w:type="paragraph" w:styleId="Seznamsodrkami4">
+  <w:style w:type="paragraph" w:styleId="ListBullet4">
     <w:name w:val="List Bullet 4"/>
-    <w:basedOn w:val="Normln"/>
+    <w:basedOn w:val="Normal"/>
     <w:autoRedefine/>
     <w:qFormat/>
     <w:rsid w:val="000F1D67"/>
@@ -5833,30 +5643,30 @@
       <w:ind w:left="1208" w:hanging="357"/>
     </w:pPr>
   </w:style>
-  <w:style w:type="paragraph" w:styleId="Seznamsodrkami5">
+  <w:style w:type="paragraph" w:styleId="ListBullet5">
     <w:name w:val="List Bullet 5"/>
-    <w:basedOn w:val="Normln"/>
+    <w:basedOn w:val="Normal"/>
     <w:semiHidden/>
     <w:qFormat/>
     <w:rsid w:val="000F1D67"/>
   </w:style>
-  <w:style w:type="paragraph" w:styleId="Seznamsodrkami">
+  <w:style w:type="paragraph" w:styleId="ListBullet">
     <w:name w:val="List Bullet"/>
-    <w:basedOn w:val="Normln"/>
+    <w:basedOn w:val="Normal"/>
     <w:semiHidden/>
     <w:qFormat/>
     <w:rsid w:val="000F1D67"/>
   </w:style>
-  <w:style w:type="paragraph" w:styleId="Seznamsodrkami2">
+  <w:style w:type="paragraph" w:styleId="ListBullet2">
     <w:name w:val="List Bullet 2"/>
-    <w:basedOn w:val="Normln"/>
+    <w:basedOn w:val="Normal"/>
     <w:semiHidden/>
     <w:qFormat/>
     <w:rsid w:val="000F1D67"/>
   </w:style>
-  <w:style w:type="paragraph" w:styleId="Textvbloku">
+  <w:style w:type="paragraph" w:styleId="BlockText">
     <w:name w:val="Block Text"/>
-    <w:basedOn w:val="Normln"/>
+    <w:basedOn w:val="Normal"/>
     <w:semiHidden/>
     <w:qFormat/>
     <w:rsid w:val="000F1D67"/>
@@ -5865,9 +5675,9 @@
       <w:ind w:left="1440" w:right="1440"/>
     </w:pPr>
   </w:style>
-  <w:style w:type="paragraph" w:styleId="Zhlavzprvy">
+  <w:style w:type="paragraph" w:styleId="MessageHeader">
     <w:name w:val="Message Header"/>
-    <w:basedOn w:val="Normln"/>
+    <w:basedOn w:val="Normal"/>
     <w:semiHidden/>
     <w:qFormat/>
     <w:rsid w:val="000F1D67"/>
@@ -5887,9 +5697,9 @@
       <w:szCs w:val="24"/>
     </w:rPr>
   </w:style>
-  <w:style w:type="paragraph" w:styleId="Zkladntextodsazen">
+  <w:style w:type="paragraph" w:styleId="BodyTextIndent">
     <w:name w:val="Body Text Indent"/>
-    <w:basedOn w:val="Normln"/>
+    <w:basedOn w:val="Normal"/>
     <w:semiHidden/>
     <w:rsid w:val="000F1D67"/>
     <w:pPr>
@@ -5897,9 +5707,9 @@
       <w:ind w:left="283"/>
     </w:pPr>
   </w:style>
-  <w:style w:type="paragraph" w:styleId="Zkladntext-prvnodsazen2">
+  <w:style w:type="paragraph" w:styleId="BodyTextFirstIndent2">
     <w:name w:val="Body Text First Indent 2"/>
-    <w:basedOn w:val="Zkladntextodsazen"/>
+    <w:basedOn w:val="BodyTextIndent"/>
     <w:semiHidden/>
     <w:qFormat/>
     <w:rsid w:val="000F1D67"/>
@@ -5907,9 +5717,9 @@
       <w:ind w:firstLine="210"/>
     </w:pPr>
   </w:style>
-  <w:style w:type="paragraph" w:styleId="Zkladntext2">
+  <w:style w:type="paragraph" w:styleId="BodyText2">
     <w:name w:val="Body Text 2"/>
-    <w:basedOn w:val="Normln"/>
+    <w:basedOn w:val="Normal"/>
     <w:semiHidden/>
     <w:qFormat/>
     <w:rsid w:val="000F1D67"/>
@@ -5917,9 +5727,9 @@
       <w:spacing w:after="120" w:line="480" w:lineRule="auto"/>
     </w:pPr>
   </w:style>
-  <w:style w:type="paragraph" w:styleId="Zkladntext3">
+  <w:style w:type="paragraph" w:styleId="BodyText3">
     <w:name w:val="Body Text 3"/>
-    <w:basedOn w:val="Normln"/>
+    <w:basedOn w:val="Normal"/>
     <w:semiHidden/>
     <w:qFormat/>
     <w:rsid w:val="000F1D67"/>
@@ -5931,9 +5741,9 @@
       <w:szCs w:val="16"/>
     </w:rPr>
   </w:style>
-  <w:style w:type="paragraph" w:styleId="Zkladntextodsazen2">
+  <w:style w:type="paragraph" w:styleId="BodyTextIndent2">
     <w:name w:val="Body Text Indent 2"/>
-    <w:basedOn w:val="Normln"/>
+    <w:basedOn w:val="Normal"/>
     <w:semiHidden/>
     <w:qFormat/>
     <w:rsid w:val="000F1D67"/>
@@ -5942,9 +5752,9 @@
       <w:ind w:left="283"/>
     </w:pPr>
   </w:style>
-  <w:style w:type="paragraph" w:styleId="Zkladntextodsazen3">
+  <w:style w:type="paragraph" w:styleId="BodyTextIndent3">
     <w:name w:val="Body Text Indent 3"/>
-    <w:basedOn w:val="Normln"/>
+    <w:basedOn w:val="Normal"/>
     <w:semiHidden/>
     <w:qFormat/>
     <w:rsid w:val="000F1D67"/>
@@ -5957,9 +5767,9 @@
       <w:szCs w:val="16"/>
     </w:rPr>
   </w:style>
-  <w:style w:type="paragraph" w:styleId="Zvr">
+  <w:style w:type="paragraph" w:styleId="Closing">
     <w:name w:val="Closing"/>
-    <w:basedOn w:val="Normln"/>
+    <w:basedOn w:val="Normal"/>
     <w:semiHidden/>
     <w:qFormat/>
     <w:rsid w:val="000F1D67"/>
@@ -5977,18 +5787,18 @@
       <w:ind w:left="567" w:hanging="567"/>
     </w:pPr>
   </w:style>
-  <w:style w:type="paragraph" w:styleId="Textkomente">
+  <w:style w:type="paragraph" w:styleId="CommentText">
     <w:name w:val="annotation text"/>
-    <w:basedOn w:val="Normln"/>
-    <w:link w:val="TextkomenteChar"/>
-    <w:qFormat/>
-    <w:rsid w:val="000F1D67"/>
-  </w:style>
-  <w:style w:type="paragraph" w:styleId="Pedmtkomente">
+    <w:basedOn w:val="Normal"/>
+    <w:link w:val="CommentTextChar"/>
+    <w:qFormat/>
+    <w:rsid w:val="000F1D67"/>
+  </w:style>
+  <w:style w:type="paragraph" w:styleId="CommentSubject">
     <w:name w:val="annotation subject"/>
-    <w:basedOn w:val="Textkomente"/>
-    <w:next w:val="Textkomente"/>
-    <w:link w:val="PedmtkomenteChar"/>
+    <w:basedOn w:val="CommentText"/>
+    <w:next w:val="CommentText"/>
+    <w:link w:val="CommentSubjectChar"/>
     <w:qFormat/>
     <w:rsid w:val="000F1D67"/>
     <w:rPr>
@@ -5996,10 +5806,10 @@
       <w:bCs/>
     </w:rPr>
   </w:style>
-  <w:style w:type="paragraph" w:styleId="Textbubliny">
+  <w:style w:type="paragraph" w:styleId="BalloonText">
     <w:name w:val="Balloon Text"/>
-    <w:basedOn w:val="Normln"/>
-    <w:link w:val="TextbublinyChar"/>
+    <w:basedOn w:val="Normal"/>
+    <w:link w:val="BalloonTextChar"/>
     <w:qFormat/>
     <w:rsid w:val="000F1D67"/>
     <w:rPr>
@@ -6024,8 +5834,8 @@
   </w:style>
   <w:style w:type="paragraph" w:customStyle="1" w:styleId="zzLc5">
     <w:name w:val="zzLc5"/>
-    <w:basedOn w:val="Normln"/>
-    <w:next w:val="Normln"/>
+    <w:basedOn w:val="Normal"/>
+    <w:next w:val="Normal"/>
     <w:qFormat/>
     <w:rsid w:val="000F1D67"/>
     <w:pPr>
@@ -6036,8 +5846,8 @@
   </w:style>
   <w:style w:type="paragraph" w:customStyle="1" w:styleId="zzLc6">
     <w:name w:val="zzLc6"/>
-    <w:basedOn w:val="Normln"/>
-    <w:next w:val="Normln"/>
+    <w:basedOn w:val="Normal"/>
+    <w:next w:val="Normal"/>
     <w:qFormat/>
     <w:rsid w:val="000F1D67"/>
     <w:pPr>
@@ -6048,8 +5858,8 @@
   </w:style>
   <w:style w:type="paragraph" w:customStyle="1" w:styleId="Figuretitle">
     <w:name w:val="Figure title"/>
-    <w:basedOn w:val="Normln"/>
-    <w:next w:val="Normln"/>
+    <w:basedOn w:val="Normal"/>
+    <w:next w:val="Normal"/>
     <w:qFormat/>
     <w:rsid w:val="000F1D67"/>
     <w:pPr>
@@ -6063,8 +5873,8 @@
   </w:style>
   <w:style w:type="paragraph" w:customStyle="1" w:styleId="a2">
     <w:name w:val="a2"/>
-    <w:basedOn w:val="Nadpis2"/>
-    <w:next w:val="Normln"/>
+    <w:basedOn w:val="Heading2"/>
+    <w:next w:val="Normal"/>
     <w:qFormat/>
     <w:rsid w:val="000F1D67"/>
     <w:pPr>
@@ -6084,8 +5894,8 @@
   </w:style>
   <w:style w:type="paragraph" w:customStyle="1" w:styleId="a3">
     <w:name w:val="a3"/>
-    <w:basedOn w:val="Nadpis3"/>
-    <w:next w:val="Normln"/>
+    <w:basedOn w:val="Heading3"/>
+    <w:next w:val="Normal"/>
     <w:qFormat/>
     <w:rsid w:val="000F1D67"/>
     <w:pPr>
@@ -6105,8 +5915,8 @@
   </w:style>
   <w:style w:type="paragraph" w:customStyle="1" w:styleId="a4">
     <w:name w:val="a4"/>
-    <w:basedOn w:val="Nadpis4"/>
-    <w:next w:val="Normln"/>
+    <w:basedOn w:val="Heading4"/>
+    <w:next w:val="Normal"/>
     <w:qFormat/>
     <w:rsid w:val="000F1D67"/>
     <w:pPr>
@@ -6124,8 +5934,8 @@
   </w:style>
   <w:style w:type="paragraph" w:customStyle="1" w:styleId="a5">
     <w:name w:val="a5"/>
-    <w:basedOn w:val="Nadpis5"/>
-    <w:next w:val="Normln"/>
+    <w:basedOn w:val="Heading5"/>
+    <w:next w:val="Normal"/>
     <w:qFormat/>
     <w:rsid w:val="000F1D67"/>
     <w:pPr>
@@ -6144,8 +5954,8 @@
   </w:style>
   <w:style w:type="paragraph" w:customStyle="1" w:styleId="a6">
     <w:name w:val="a6"/>
-    <w:basedOn w:val="Nadpis6"/>
-    <w:next w:val="Normln"/>
+    <w:basedOn w:val="Heading6"/>
+    <w:next w:val="Normal"/>
     <w:qFormat/>
     <w:rsid w:val="000F1D67"/>
     <w:pPr>
@@ -6164,8 +5974,8 @@
   </w:style>
   <w:style w:type="paragraph" w:customStyle="1" w:styleId="ANNEX">
     <w:name w:val="ANNEX"/>
-    <w:basedOn w:val="Normln"/>
-    <w:next w:val="Normln"/>
+    <w:basedOn w:val="Normal"/>
+    <w:next w:val="Normal"/>
     <w:qFormat/>
     <w:rsid w:val="000F1D67"/>
     <w:pPr>
@@ -6182,15 +5992,15 @@
   </w:style>
   <w:style w:type="paragraph" w:customStyle="1" w:styleId="Definition">
     <w:name w:val="Definition"/>
-    <w:basedOn w:val="Normln"/>
-    <w:next w:val="Normln"/>
+    <w:basedOn w:val="Normal"/>
+    <w:next w:val="Normal"/>
     <w:qFormat/>
     <w:rsid w:val="000F1D67"/>
   </w:style>
   <w:style w:type="paragraph" w:customStyle="1" w:styleId="Note">
     <w:name w:val="Note"/>
-    <w:basedOn w:val="Normln"/>
-    <w:next w:val="Normln"/>
+    <w:basedOn w:val="Normal"/>
+    <w:next w:val="Normal"/>
     <w:qFormat/>
     <w:rsid w:val="000F1D67"/>
     <w:pPr>
@@ -6205,7 +6015,7 @@
   </w:style>
   <w:style w:type="paragraph" w:customStyle="1" w:styleId="Terms">
     <w:name w:val="Term(s)"/>
-    <w:basedOn w:val="Normln"/>
+    <w:basedOn w:val="Normal"/>
     <w:next w:val="Definition"/>
     <w:qFormat/>
     <w:rsid w:val="000F1D67"/>
@@ -6219,7 +6029,7 @@
   </w:style>
   <w:style w:type="paragraph" w:customStyle="1" w:styleId="TermNum">
     <w:name w:val="TermNum"/>
-    <w:basedOn w:val="Normln"/>
+    <w:basedOn w:val="Normal"/>
     <w:next w:val="Terms"/>
     <w:qFormat/>
     <w:rsid w:val="000F1D67"/>
@@ -6232,8 +6042,8 @@
   </w:style>
   <w:style w:type="paragraph" w:customStyle="1" w:styleId="Tabletitle">
     <w:name w:val="Table title"/>
-    <w:basedOn w:val="Normln"/>
-    <w:next w:val="Normln"/>
+    <w:basedOn w:val="Normal"/>
+    <w:next w:val="Normal"/>
     <w:qFormat/>
     <w:rsid w:val="000F1D67"/>
     <w:pPr>
@@ -6250,7 +6060,7 @@
   </w:style>
   <w:style w:type="paragraph" w:customStyle="1" w:styleId="Tabletext10">
     <w:name w:val="Table text (10)"/>
-    <w:basedOn w:val="Normln"/>
+    <w:basedOn w:val="Normal"/>
     <w:qFormat/>
     <w:rsid w:val="000F1D67"/>
     <w:pPr>
@@ -6274,7 +6084,7 @@
   </w:style>
   <w:style w:type="paragraph" w:customStyle="1" w:styleId="Tabelle">
     <w:name w:val="Tabelle"/>
-    <w:basedOn w:val="Zkladntext"/>
+    <w:basedOn w:val="BodyText"/>
     <w:qFormat/>
     <w:rsid w:val="000F1D67"/>
     <w:pPr>
@@ -6290,7 +6100,7 @@
   </w:style>
   <w:style w:type="paragraph" w:customStyle="1" w:styleId="Tabletext8">
     <w:name w:val="Table text (8)"/>
-    <w:basedOn w:val="Normln"/>
+    <w:basedOn w:val="Normal"/>
     <w:qFormat/>
     <w:rsid w:val="000F1D67"/>
     <w:pPr>
@@ -6304,8 +6114,8 @@
   </w:style>
   <w:style w:type="paragraph" w:customStyle="1" w:styleId="zzLn5">
     <w:name w:val="zzLn5"/>
-    <w:basedOn w:val="Normln"/>
-    <w:next w:val="Normln"/>
+    <w:basedOn w:val="Normal"/>
+    <w:next w:val="Normal"/>
     <w:qFormat/>
     <w:rsid w:val="000F1D67"/>
     <w:pPr>
@@ -6321,8 +6131,8 @@
   </w:style>
   <w:style w:type="paragraph" w:customStyle="1" w:styleId="zzLn6">
     <w:name w:val="zzLn6"/>
-    <w:basedOn w:val="Normln"/>
-    <w:next w:val="Normln"/>
+    <w:basedOn w:val="Normal"/>
+    <w:next w:val="Normal"/>
     <w:qFormat/>
     <w:rsid w:val="000F1D67"/>
     <w:pPr>
@@ -6338,8 +6148,8 @@
   </w:style>
   <w:style w:type="paragraph" w:customStyle="1" w:styleId="Example">
     <w:name w:val="Example"/>
-    <w:basedOn w:val="Normln"/>
-    <w:next w:val="Normln"/>
+    <w:basedOn w:val="Normal"/>
+    <w:next w:val="Normal"/>
     <w:qFormat/>
     <w:rsid w:val="000F1D67"/>
     <w:pPr>
@@ -6356,8 +6166,8 @@
   </w:style>
   <w:style w:type="paragraph" w:customStyle="1" w:styleId="H6">
     <w:name w:val="H6"/>
-    <w:basedOn w:val="Nadpis5"/>
-    <w:next w:val="Normln"/>
+    <w:basedOn w:val="Heading5"/>
+    <w:next w:val="Normal"/>
     <w:qFormat/>
     <w:rsid w:val="000F1D67"/>
     <w:pPr>
@@ -6391,7 +6201,7 @@
   </w:style>
   <w:style w:type="paragraph" w:customStyle="1" w:styleId="TAL">
     <w:name w:val="TAL"/>
-    <w:basedOn w:val="Normln"/>
+    <w:basedOn w:val="Normal"/>
     <w:qFormat/>
     <w:rsid w:val="000F1D67"/>
     <w:pPr>
@@ -6406,7 +6216,7 @@
   </w:style>
   <w:style w:type="paragraph" w:customStyle="1" w:styleId="Normal1">
     <w:name w:val="Normal1"/>
-    <w:basedOn w:val="Normln"/>
+    <w:basedOn w:val="Normal"/>
     <w:qFormat/>
     <w:rsid w:val="000F1D67"/>
     <w:pPr>
@@ -6420,8 +6230,8 @@
   </w:style>
   <w:style w:type="paragraph" w:customStyle="1" w:styleId="TH">
     <w:name w:val="TH"/>
-    <w:basedOn w:val="Normln"/>
-    <w:next w:val="Normln"/>
+    <w:basedOn w:val="Normal"/>
+    <w:next w:val="Normal"/>
     <w:qFormat/>
     <w:rsid w:val="000F1D67"/>
     <w:pPr>
@@ -6438,8 +6248,8 @@
   </w:style>
   <w:style w:type="paragraph" w:customStyle="1" w:styleId="zzBiblio">
     <w:name w:val="zzBiblio"/>
-    <w:basedOn w:val="Normln"/>
-    <w:next w:val="Normln"/>
+    <w:basedOn w:val="Normal"/>
+    <w:next w:val="Normal"/>
     <w:qFormat/>
     <w:rsid w:val="000F1D67"/>
     <w:pPr>
@@ -6466,15 +6276,15 @@
     <w:qFormat/>
     <w:rsid w:val="000F1D67"/>
   </w:style>
-  <w:style w:type="numbering" w:styleId="lnekoddl">
+  <w:style w:type="numbering" w:styleId="ArticleSection">
     <w:name w:val="Outline List 3"/>
     <w:semiHidden/>
     <w:qFormat/>
     <w:rsid w:val="000F1D67"/>
   </w:style>
-  <w:style w:type="table" w:styleId="Barevntabulka1">
+  <w:style w:type="table" w:styleId="TableColourful1">
     <w:name w:val="Table Colorful 1"/>
-    <w:basedOn w:val="Normlntabulka"/>
+    <w:basedOn w:val="TableNormal"/>
     <w:semiHidden/>
     <w:rsid w:val="000F1D67"/>
     <w:rPr>
@@ -6547,9 +6357,9 @@
       </w:tcPr>
     </w:tblStylePr>
   </w:style>
-  <w:style w:type="table" w:styleId="Barevntabulka2">
+  <w:style w:type="table" w:styleId="TableColourful2">
     <w:name w:val="Table Colorful 2"/>
-    <w:basedOn w:val="Normlntabulka"/>
+    <w:basedOn w:val="TableNormal"/>
     <w:semiHidden/>
     <w:rsid w:val="000F1D67"/>
     <w:tblPr>
@@ -6616,9 +6426,9 @@
       </w:tcPr>
     </w:tblStylePr>
   </w:style>
-  <w:style w:type="table" w:styleId="Barevntabulka3">
+  <w:style w:type="table" w:styleId="TableColourful3">
     <w:name w:val="Table Colorful 3"/>
-    <w:basedOn w:val="Normlntabulka"/>
+    <w:basedOn w:val="TableNormal"/>
     <w:semiHidden/>
     <w:rsid w:val="000F1D67"/>
     <w:tblPr>
@@ -6672,9 +6482,9 @@
       </w:tcPr>
     </w:tblStylePr>
   </w:style>
-  <w:style w:type="table" w:styleId="Elegantntabulka">
+  <w:style w:type="table" w:styleId="TableElegant">
     <w:name w:val="Table Elegant"/>
-    <w:basedOn w:val="Normlntabulka"/>
+    <w:basedOn w:val="TableNormal"/>
     <w:semiHidden/>
     <w:rsid w:val="000F1D67"/>
     <w:tblPr>
@@ -6704,9 +6514,9 @@
       </w:tcPr>
     </w:tblStylePr>
   </w:style>
-  <w:style w:type="table" w:styleId="Jednoduchtabulka1">
+  <w:style w:type="table" w:styleId="TableSimple1">
     <w:name w:val="Table Simple 1"/>
-    <w:basedOn w:val="Normlntabulka"/>
+    <w:basedOn w:val="TableNormal"/>
     <w:semiHidden/>
     <w:rsid w:val="000F1D67"/>
     <w:tblPr>
@@ -6739,9 +6549,9 @@
       </w:tcPr>
     </w:tblStylePr>
   </w:style>
-  <w:style w:type="table" w:styleId="Jednoduchtabulka2">
+  <w:style w:type="table" w:styleId="TableSimple2">
     <w:name w:val="Table Simple 2"/>
-    <w:basedOn w:val="Normlntabulka"/>
+    <w:basedOn w:val="TableNormal"/>
     <w:semiHidden/>
     <w:rsid w:val="000F1D67"/>
     <w:tblPr/>
@@ -6831,9 +6641,9 @@
       </w:tcPr>
     </w:tblStylePr>
   </w:style>
-  <w:style w:type="table" w:styleId="Jednoduchtabulka3">
+  <w:style w:type="table" w:styleId="TableSimple3">
     <w:name w:val="Table Simple 3"/>
-    <w:basedOn w:val="Normlntabulka"/>
+    <w:basedOn w:val="TableNormal"/>
     <w:semiHidden/>
     <w:rsid w:val="000F1D67"/>
     <w:tblPr>
@@ -6863,9 +6673,9 @@
       </w:tcPr>
     </w:tblStylePr>
   </w:style>
-  <w:style w:type="table" w:styleId="Klasicktabulka1">
+  <w:style w:type="table" w:styleId="TableClassic1">
     <w:name w:val="Table Classic 1"/>
-    <w:basedOn w:val="Normlntabulka"/>
+    <w:basedOn w:val="TableNormal"/>
     <w:semiHidden/>
     <w:rsid w:val="000F1D67"/>
     <w:tblPr>
@@ -6941,9 +6751,9 @@
       </w:tcPr>
     </w:tblStylePr>
   </w:style>
-  <w:style w:type="table" w:styleId="Klasicktabulka2">
+  <w:style w:type="table" w:styleId="TableClassic2">
     <w:name w:val="Table Classic 2"/>
-    <w:basedOn w:val="Normlntabulka"/>
+    <w:basedOn w:val="TableNormal"/>
     <w:semiHidden/>
     <w:rsid w:val="000F1D67"/>
     <w:tblPr>
@@ -7029,9 +6839,9 @@
       </w:tcPr>
     </w:tblStylePr>
   </w:style>
-  <w:style w:type="table" w:styleId="Klasicktabulka3">
+  <w:style w:type="table" w:styleId="TableClassic3">
     <w:name w:val="Table Classic 3"/>
-    <w:basedOn w:val="Normlntabulka"/>
+    <w:basedOn w:val="TableNormal"/>
     <w:semiHidden/>
     <w:rsid w:val="000F1D67"/>
     <w:rPr>
@@ -7094,9 +6904,9 @@
       </w:tcPr>
     </w:tblStylePr>
   </w:style>
-  <w:style w:type="table" w:styleId="Klasicktabulka4">
+  <w:style w:type="table" w:styleId="TableClassic4">
     <w:name w:val="Table Classic 4"/>
-    <w:basedOn w:val="Normlntabulka"/>
+    <w:basedOn w:val="TableNormal"/>
     <w:semiHidden/>
     <w:rsid w:val="000F1D67"/>
     <w:tblPr>
@@ -7180,9 +6990,9 @@
       </w:tcPr>
     </w:tblStylePr>
   </w:style>
-  <w:style w:type="table" w:styleId="Moderntabulka">
+  <w:style w:type="table" w:styleId="TableContemporary">
     <w:name w:val="Table Contemporary"/>
-    <w:basedOn w:val="Normlntabulka"/>
+    <w:basedOn w:val="TableNormal"/>
     <w:semiHidden/>
     <w:rsid w:val="000F1D67"/>
     <w:tblPr>
@@ -7234,9 +7044,9 @@
       </w:tcPr>
     </w:tblStylePr>
   </w:style>
-  <w:style w:type="table" w:styleId="Motivtabulky">
+  <w:style w:type="table" w:styleId="TableTheme">
     <w:name w:val="Table Theme"/>
-    <w:basedOn w:val="Normlntabulka"/>
+    <w:basedOn w:val="TableNormal"/>
     <w:semiHidden/>
     <w:rsid w:val="000F1D67"/>
     <w:tblPr>
@@ -7250,9 +7060,9 @@
       </w:tblBorders>
     </w:tblPr>
   </w:style>
-  <w:style w:type="table" w:styleId="Mkatabulky">
+  <w:style w:type="table" w:styleId="TableGrid">
     <w:name w:val="Table Grid"/>
-    <w:basedOn w:val="Normlntabulka"/>
+    <w:basedOn w:val="TableNormal"/>
     <w:rsid w:val="000F1D67"/>
     <w:tblPr>
       <w:tblBorders>
@@ -7265,9 +7075,9 @@
       </w:tblBorders>
     </w:tblPr>
   </w:style>
-  <w:style w:type="table" w:styleId="Mkatabulky1">
+  <w:style w:type="table" w:styleId="TableGrid1">
     <w:name w:val="Table Grid 1"/>
-    <w:basedOn w:val="Normlntabulka"/>
+    <w:basedOn w:val="TableNormal"/>
     <w:semiHidden/>
     <w:rsid w:val="000F1D67"/>
     <w:tblPr>
@@ -7308,9 +7118,9 @@
       </w:tcPr>
     </w:tblStylePr>
   </w:style>
-  <w:style w:type="table" w:styleId="Mkatabulky2">
+  <w:style w:type="table" w:styleId="TableGrid2">
     <w:name w:val="Table Grid 2"/>
-    <w:basedOn w:val="Normlntabulka"/>
+    <w:basedOn w:val="TableNormal"/>
     <w:semiHidden/>
     <w:rsid w:val="000F1D67"/>
     <w:tblPr>
@@ -7376,9 +7186,9 @@
       </w:tcPr>
     </w:tblStylePr>
   </w:style>
-  <w:style w:type="table" w:styleId="Mkatabulky4">
+  <w:style w:type="table" w:styleId="TableGrid4">
     <w:name w:val="Table Grid 4"/>
-    <w:basedOn w:val="Normlntabulka"/>
+    <w:basedOn w:val="TableNormal"/>
     <w:semiHidden/>
     <w:rsid w:val="000F1D67"/>
     <w:tblPr>
@@ -7437,9 +7247,9 @@
       </w:tcPr>
     </w:tblStylePr>
   </w:style>
-  <w:style w:type="table" w:styleId="Mkatabulky5">
+  <w:style w:type="table" w:styleId="TableGrid5">
     <w:name w:val="Table Grid 5"/>
-    <w:basedOn w:val="Normlntabulka"/>
+    <w:basedOn w:val="TableNormal"/>
     <w:semiHidden/>
     <w:rsid w:val="000F1D67"/>
     <w:tblPr>
@@ -7501,9 +7311,9 @@
       </w:tcPr>
     </w:tblStylePr>
   </w:style>
-  <w:style w:type="table" w:styleId="Mkatabulky6">
+  <w:style w:type="table" w:styleId="TableGrid6">
     <w:name w:val="Table Grid 6"/>
-    <w:basedOn w:val="Normlntabulka"/>
+    <w:basedOn w:val="TableNormal"/>
     <w:semiHidden/>
     <w:rsid w:val="000F1D67"/>
     <w:tblPr>
@@ -7568,9 +7378,9 @@
       </w:tcPr>
     </w:tblStylePr>
   </w:style>
-  <w:style w:type="table" w:styleId="Mkatabulky7">
+  <w:style w:type="table" w:styleId="TableGrid7">
     <w:name w:val="Table Grid 7"/>
-    <w:basedOn w:val="Normlntabulka"/>
+    <w:basedOn w:val="TableNormal"/>
     <w:semiHidden/>
     <w:rsid w:val="000F1D67"/>
     <w:rPr>
@@ -7654,9 +7464,9 @@
       </w:tcPr>
     </w:tblStylePr>
   </w:style>
-  <w:style w:type="table" w:styleId="Mkatabulky8">
+  <w:style w:type="table" w:styleId="TableGrid8">
     <w:name w:val="Table Grid 8"/>
-    <w:basedOn w:val="Normlntabulka"/>
+    <w:basedOn w:val="TableNormal"/>
     <w:semiHidden/>
     <w:rsid w:val="000F1D67"/>
     <w:tblPr>
@@ -7716,9 +7526,9 @@
       </w:tcPr>
     </w:tblStylePr>
   </w:style>
-  <w:style w:type="table" w:styleId="Profesionlntabulka">
+  <w:style w:type="table" w:styleId="TableProfessional">
     <w:name w:val="Table Professional"/>
-    <w:basedOn w:val="Normlntabulka"/>
+    <w:basedOn w:val="TableNormal"/>
     <w:semiHidden/>
     <w:rsid w:val="000F1D67"/>
     <w:tblPr>
@@ -7750,9 +7560,9 @@
       </w:tcPr>
     </w:tblStylePr>
   </w:style>
-  <w:style w:type="table" w:styleId="Sloupcetabulky1">
+  <w:style w:type="table" w:styleId="TableColumns1">
     <w:name w:val="Table Columns 1"/>
-    <w:basedOn w:val="Normlntabulka"/>
+    <w:basedOn w:val="TableNormal"/>
     <w:semiHidden/>
     <w:rsid w:val="000F1D67"/>
     <w:rPr>
@@ -7866,9 +7676,9 @@
       </w:tcPr>
     </w:tblStylePr>
   </w:style>
-  <w:style w:type="table" w:styleId="Sloupcetabulky2">
+  <w:style w:type="table" w:styleId="TableColumns2">
     <w:name w:val="Table Columns 2"/>
-    <w:basedOn w:val="Normlntabulka"/>
+    <w:basedOn w:val="TableNormal"/>
     <w:semiHidden/>
     <w:rsid w:val="000F1D67"/>
     <w:rPr>
@@ -7976,9 +7786,9 @@
       </w:tcPr>
     </w:tblStylePr>
   </w:style>
-  <w:style w:type="table" w:styleId="Sloupcetabulky3">
+  <w:style w:type="table" w:styleId="TableColumns3">
     <w:name w:val="Table Columns 3"/>
-    <w:basedOn w:val="Normlntabulka"/>
+    <w:basedOn w:val="TableNormal"/>
     <w:semiHidden/>
     <w:rsid w:val="000F1D67"/>
     <w:rPr>
@@ -8080,9 +7890,9 @@
       </w:tcPr>
     </w:tblStylePr>
   </w:style>
-  <w:style w:type="table" w:styleId="Sloupcetabulky4">
+  <w:style w:type="table" w:styleId="TableColumns4">
     <w:name w:val="Table Columns 4"/>
-    <w:basedOn w:val="Normlntabulka"/>
+    <w:basedOn w:val="TableNormal"/>
     <w:semiHidden/>
     <w:rsid w:val="000F1D67"/>
     <w:tblPr>
@@ -8146,9 +7956,9 @@
       </w:tcPr>
     </w:tblStylePr>
   </w:style>
-  <w:style w:type="table" w:styleId="Sloupcetabulky5">
+  <w:style w:type="table" w:styleId="TableColumns5">
     <w:name w:val="Table Columns 5"/>
-    <w:basedOn w:val="Normlntabulka"/>
+    <w:basedOn w:val="TableNormal"/>
     <w:semiHidden/>
     <w:rsid w:val="000F1D67"/>
     <w:tblPr>
@@ -8231,9 +8041,9 @@
       </w:rPr>
     </w:tblStylePr>
   </w:style>
-  <w:style w:type="table" w:styleId="Tabulkajakoseznam1">
+  <w:style w:type="table" w:styleId="TableList1">
     <w:name w:val="Table List 1"/>
-    <w:basedOn w:val="Normlntabulka"/>
+    <w:basedOn w:val="TableNormal"/>
     <w:semiHidden/>
     <w:rsid w:val="000F1D67"/>
     <w:tblPr>
@@ -8311,9 +8121,9 @@
       </w:tcPr>
     </w:tblStylePr>
   </w:style>
-  <w:style w:type="table" w:styleId="Tabulkajakoseznam2">
+  <w:style w:type="table" w:styleId="TableList2">
     <w:name w:val="Table List 2"/>
-    <w:basedOn w:val="Normlntabulka"/>
+    <w:basedOn w:val="TableNormal"/>
     <w:semiHidden/>
     <w:rsid w:val="000F1D67"/>
     <w:tblPr>
@@ -8387,9 +8197,9 @@
       </w:tcPr>
     </w:tblStylePr>
   </w:style>
-  <w:style w:type="table" w:styleId="Tabulkajakoseznam3">
+  <w:style w:type="table" w:styleId="TableList3">
     <w:name w:val="Table List 3"/>
-    <w:basedOn w:val="Normlntabulka"/>
+    <w:basedOn w:val="TableNormal"/>
     <w:semiHidden/>
     <w:rsid w:val="000F1D67"/>
     <w:tblPr>
@@ -8441,9 +8251,9 @@
       </w:tcPr>
     </w:tblStylePr>
   </w:style>
-  <w:style w:type="table" w:styleId="Tabulkajakoseznam4">
+  <w:style w:type="table" w:styleId="TableList4">
     <w:name w:val="Table List 4"/>
-    <w:basedOn w:val="Normlntabulka"/>
+    <w:basedOn w:val="TableNormal"/>
     <w:semiHidden/>
     <w:rsid w:val="000F1D67"/>
     <w:tblPr>
@@ -8475,9 +8285,9 @@
       </w:tcPr>
     </w:tblStylePr>
   </w:style>
-  <w:style w:type="table" w:styleId="Tabulkajakoseznam5">
+  <w:style w:type="table" w:styleId="TableList5">
     <w:name w:val="Table List 5"/>
-    <w:basedOn w:val="Normlntabulka"/>
+    <w:basedOn w:val="TableNormal"/>
     <w:semiHidden/>
     <w:rsid w:val="000F1D67"/>
     <w:tblPr>
@@ -8520,9 +8330,9 @@
       </w:tcPr>
     </w:tblStylePr>
   </w:style>
-  <w:style w:type="table" w:styleId="Tabulkajakoseznam6">
+  <w:style w:type="table" w:styleId="TableList6">
     <w:name w:val="Table List 6"/>
-    <w:basedOn w:val="Normlntabulka"/>
+    <w:basedOn w:val="TableNormal"/>
     <w:semiHidden/>
     <w:rsid w:val="000F1D67"/>
     <w:tblPr>
@@ -8576,9 +8386,9 @@
       </w:tcPr>
     </w:tblStylePr>
   </w:style>
-  <w:style w:type="table" w:styleId="Tabulkajakoseznam7">
+  <w:style w:type="table" w:styleId="TableList7">
     <w:name w:val="Table List 7"/>
-    <w:basedOn w:val="Normlntabulka"/>
+    <w:basedOn w:val="TableNormal"/>
     <w:semiHidden/>
     <w:rsid w:val="000F1D67"/>
     <w:tblPr>
@@ -8670,9 +8480,9 @@
       </w:tcPr>
     </w:tblStylePr>
   </w:style>
-  <w:style w:type="table" w:styleId="Tabulkajakoseznam8">
+  <w:style w:type="table" w:styleId="TableList8">
     <w:name w:val="Table List 8"/>
-    <w:basedOn w:val="Normlntabulka"/>
+    <w:basedOn w:val="TableNormal"/>
     <w:semiHidden/>
     <w:rsid w:val="000F1D67"/>
     <w:tblPr>
@@ -8765,9 +8575,9 @@
       </w:tcPr>
     </w:tblStylePr>
   </w:style>
-  <w:style w:type="table" w:styleId="Tabulkasprostorovmiefekty1">
+  <w:style w:type="table" w:styleId="Table3Deffects1">
     <w:name w:val="Table 3D effects 1"/>
-    <w:basedOn w:val="Normlntabulka"/>
+    <w:basedOn w:val="TableNormal"/>
     <w:semiHidden/>
     <w:rsid w:val="000F1D67"/>
     <w:tblPr/>
@@ -8871,9 +8681,9 @@
       </w:tcPr>
     </w:tblStylePr>
   </w:style>
-  <w:style w:type="table" w:styleId="Tabulkasprostorovmiefekty2">
+  <w:style w:type="table" w:styleId="Table3Deffects2">
     <w:name w:val="Table 3D effects 2"/>
-    <w:basedOn w:val="Normlntabulka"/>
+    <w:basedOn w:val="TableNormal"/>
     <w:semiHidden/>
     <w:rsid w:val="000F1D67"/>
     <w:tblPr>
@@ -8942,9 +8752,9 @@
       </w:tcPr>
     </w:tblStylePr>
   </w:style>
-  <w:style w:type="table" w:styleId="Tabulkasprostorovmiefekty3">
+  <w:style w:type="table" w:styleId="Table3Deffects3">
     <w:name w:val="Table 3D effects 3"/>
-    <w:basedOn w:val="Normlntabulka"/>
+    <w:basedOn w:val="TableNormal"/>
     <w:semiHidden/>
     <w:rsid w:val="000F1D67"/>
     <w:tblPr>
@@ -9029,9 +8839,9 @@
       </w:tcPr>
     </w:tblStylePr>
   </w:style>
-  <w:style w:type="table" w:styleId="Tabulkastlumenmibarvami1">
+  <w:style w:type="table" w:styleId="TableSubtle1">
     <w:name w:val="Table Subtle 1"/>
-    <w:basedOn w:val="Normlntabulka"/>
+    <w:basedOn w:val="TableNormal"/>
     <w:semiHidden/>
     <w:rsid w:val="000F1D67"/>
     <w:tblPr>
@@ -9117,9 +8927,9 @@
       </w:tcPr>
     </w:tblStylePr>
   </w:style>
-  <w:style w:type="table" w:styleId="Tabulkastlumenmibarvami2">
+  <w:style w:type="table" w:styleId="TableSubtle2">
     <w:name w:val="Table Subtle 2"/>
-    <w:basedOn w:val="Normlntabulka"/>
+    <w:basedOn w:val="TableNormal"/>
     <w:semiHidden/>
     <w:rsid w:val="000F1D67"/>
     <w:tblPr>
@@ -9197,9 +9007,9 @@
       </w:tcPr>
     </w:tblStylePr>
   </w:style>
-  <w:style w:type="table" w:styleId="Webovtabulka1">
+  <w:style w:type="table" w:styleId="TableWeb1">
     <w:name w:val="Table Web 1"/>
-    <w:basedOn w:val="Normlntabulka"/>
+    <w:basedOn w:val="TableNormal"/>
     <w:semiHidden/>
     <w:rsid w:val="000F1D67"/>
     <w:tblPr>
@@ -9228,9 +9038,9 @@
       </w:tcPr>
     </w:tblStylePr>
   </w:style>
-  <w:style w:type="table" w:styleId="Webovtabulka2">
+  <w:style w:type="table" w:styleId="TableWeb2">
     <w:name w:val="Table Web 2"/>
-    <w:basedOn w:val="Normlntabulka"/>
+    <w:basedOn w:val="TableNormal"/>
     <w:semiHidden/>
     <w:rsid w:val="000F1D67"/>
     <w:tblPr>
@@ -9259,9 +9069,9 @@
       </w:tcPr>
     </w:tblStylePr>
   </w:style>
-  <w:style w:type="table" w:styleId="Webovtabulka3">
+  <w:style w:type="table" w:styleId="TableWeb3">
     <w:name w:val="Table Web 3"/>
-    <w:basedOn w:val="Normlntabulka"/>
+    <w:basedOn w:val="TableNormal"/>
     <w:semiHidden/>
     <w:rsid w:val="000F1D67"/>
     <w:tblPr>

</xml_diff>